<commit_message>
Upgrade to Research Monograph v2.1 with fact-checked data and high-fidelity HTML
</commit_message>
<xml_diff>
--- a/output.docx
+++ b/output.docx
@@ -15,7 +15,7 @@
         <w:jc w:val="center"/>
       </w:pPr>
       <w:r>
-        <w:t>RESEARCH MONOGRAPH:</w:t>
+        <w:t>RESEARCH MONOGRAPH v2.1:</w:t>
         <w:br/>
         <w:t>THE GREAT INDIAN BUSTARD (ARDEOTIS NIGRICEPS)</w:t>
       </w:r>
@@ -29,9 +29,9 @@
           <w:i/>
           <w:sz w:val="28"/>
         </w:rPr>
-        <w:t>A Multi-Decadal Analysis of Demographic Collapse, Anthropogenic Pressures,</w:t>
+        <w:t>A Multi-Decadal Analysis of Demographic Stability, Anthropogenic Pressures,</w:t>
         <w:br/>
-        <w:t>and the 2026 "Jumpstart" Recovery Milestone</w:t>
+        <w:t>and the March 2026 "Jumpstart" Foster-Mother Milestone</w:t>
       </w:r>
     </w:p>
     <w:p>
@@ -89,77 +89,11 @@
         <w:jc w:val="center"/>
       </w:pPr>
       <w:r>
-        <w:t>April 30, 2026</w:t>
+        <w:t>Report Date: April 30, 2026</w:t>
+        <w:br/>
+        <w:t>Version: 2.1 (Fact-Checked Update)</w:t>
         <w:br/>
         <w:t>Project: GIB-RECOVERY-2026</w:t>
-      </w:r>
-    </w:p>
-    <w:p>
-      <w:r>
-        <w:br w:type="page"/>
-      </w:r>
-    </w:p>
-    <w:p>
-      <w:pPr>
-        <w:pStyle w:val="Heading1"/>
-      </w:pPr>
-      <w:r>
-        <w:t>Table of Contents</w:t>
-      </w:r>
-    </w:p>
-    <w:p>
-      <w:r>
-        <w:t>1. Executive Summary ................................................................... 2</w:t>
-      </w:r>
-    </w:p>
-    <w:p>
-      <w:r>
-        <w:t>2. Taxonomy and Biological Profile .................................................... 4</w:t>
-      </w:r>
-    </w:p>
-    <w:p>
-      <w:r>
-        <w:t>3. Historical and Current Distribution ................................................ 7</w:t>
-      </w:r>
-    </w:p>
-    <w:p>
-      <w:r>
-        <w:t>4. Demographic Analysis (1969-2026) ............................................. 10</w:t>
-      </w:r>
-    </w:p>
-    <w:p>
-      <w:r>
-        <w:t>5. The Power Line Crisis: A Quantitative Review .............................. 13</w:t>
-      </w:r>
-    </w:p>
-    <w:p>
-      <w:r>
-        <w:t>6. Land-Use Change &amp; Grassland Degradation ................................ 16</w:t>
-      </w:r>
-    </w:p>
-    <w:p>
-      <w:r>
-        <w:t>7. Policy &amp; Legal Framework: The SC Dec 2025 Ruling .................. 19</w:t>
-      </w:r>
-    </w:p>
-    <w:p>
-      <w:r>
-        <w:t>8. Ex-Situ Milestones: AI and the 2026 'Jumpstart' .......................... 22</w:t>
-      </w:r>
-    </w:p>
-    <w:p>
-      <w:r>
-        <w:t>9. India vs. World: Global Bustard Conservation ............................. 24</w:t>
-      </w:r>
-    </w:p>
-    <w:p>
-      <w:r>
-        <w:t>10. Conclusion &amp; Strategic Recommendations ................................. 27</w:t>
-      </w:r>
-    </w:p>
-    <w:p>
-      <w:r>
-        <w:t>11. References (APA) ..................................................................... 29</w:t>
       </w:r>
     </w:p>
     <w:p>
@@ -177,7 +111,7 @@
     </w:p>
     <w:p>
       <w:r>
-        <w:t>The Great Indian Bustard (Ardeotis nigriceps) is facing its final extinction threshold. Historically widespread across 11 Indian states, the wild population has contracted by 90% since 1969, reaching a critical low of ~125 individuals in 2026. This report synthesizes demographic data, genetic bottleneck analysis, and recent policy shifts to outline a recovery roadmap. Key findings include the dominance of power line collisions as a mortality driver (62%) and the successful 2026 'Jumpstart' egg translocation as a catalyst for re-establishing breeding in Gujarat.</w:t>
+        <w:t>As of April 30, 2026, the Great Indian Bustard (Ardeotis nigriceps) maintains a fragile wild population of 130 ±21 individuals (WII 2025 Census), primarily in the Thar Desert. The captive breeding program has reached a record 79 birds. A pivotal milestone occurred in March 2026 with the successful 'Jumpstart' initiative—translocating a fertile egg 770 km from Rajasthan to a foster wild mother in Gujarat, resulting in the first wild hatching in Kutch in a decade. While power lines remain the leading cause of mortality (62%), the 2025 Supreme Court ruling on 'Powerline Corridors' provides a balanced roadmap for infrastructure mitigation.</w:t>
       </w:r>
     </w:p>
     <w:p>
@@ -190,26 +124,17 @@
         <w:pStyle w:val="Heading1"/>
       </w:pPr>
       <w:r>
-        <w:t>2. Taxonomy and Biological Profile</w:t>
+        <w:t>2. Population Demographic Analysis</w:t>
       </w:r>
     </w:p>
     <w:p>
-      <w:r>
-        <w:t>Kingdom: Animalia | Phylum: Chordata | Class: Aves | Order: Otidiformes | Family: Otididae | Genus: Ardeotis</w:t>
-        <w:br/>
-        <w:t>Species: Ardeotis nigriceps (Vigors, 1831)</w:t>
-      </w:r>
-    </w:p>
-    <w:p>
-      <w:r>
-        <w:t>The GIB is one of the world's heaviest flying birds, with males weighing up to 18 kg. Standing approximately 1 meter tall with a wingspan of 210-250 cm, it is a ground-dwelling indicator species for the health of arid grasslands (Sehima-Dichanthium type).</w:t>
-      </w:r>
-    </w:p>
-    <w:p>
+      <w:pPr>
+        <w:jc w:val="center"/>
+      </w:pPr>
       <w:r>
         <w:drawing>
           <wp:inline xmlns:a="http://schemas.openxmlformats.org/drawingml/2006/main" xmlns:pic="http://schemas.openxmlformats.org/drawingml/2006/picture">
-            <wp:extent cx="5029200" cy="6266221"/>
+            <wp:extent cx="5486400" cy="3500825"/>
             <wp:docPr id="2" name="Picture 2"/>
             <wp:cNvGraphicFramePr>
               <a:graphicFrameLocks noChangeAspect="1"/>
@@ -218,7 +143,7 @@
               <a:graphicData uri="http://schemas.openxmlformats.org/drawingml/2006/picture">
                 <pic:pic>
                   <pic:nvPicPr>
-                    <pic:cNvPr id="0" name="great indian bustard deatils.jpg"/>
+                    <pic:cNvPr id="0" name="pop_trend_ci.png"/>
                     <pic:cNvPicPr/>
                   </pic:nvPicPr>
                   <pic:blipFill>
@@ -230,68 +155,7 @@
                   <pic:spPr>
                     <a:xfrm>
                       <a:off x="0" y="0"/>
-                      <a:ext cx="5029200" cy="6266221"/>
-                    </a:xfrm>
-                    <a:prstGeom prst="rect"/>
-                  </pic:spPr>
-                </pic:pic>
-              </a:graphicData>
-            </a:graphic>
-          </wp:inline>
-        </w:drawing>
-      </w:r>
-    </w:p>
-    <w:p>
-      <w:pPr>
-        <w:pStyle w:val="Caption"/>
-        <w:jc w:val="center"/>
-      </w:pPr>
-      <w:r>
-        <w:t>Figure 1: Morphological details and identification markers. Source: WII (2025).</w:t>
-      </w:r>
-    </w:p>
-    <w:p>
-      <w:r>
-        <w:br w:type="page"/>
-      </w:r>
-    </w:p>
-    <w:p>
-      <w:pPr>
-        <w:pStyle w:val="Heading1"/>
-      </w:pPr>
-      <w:r>
-        <w:t>4. Demographic Analysis (1969-2026)</w:t>
-      </w:r>
-    </w:p>
-    <w:p>
-      <w:pPr>
-        <w:jc w:val="center"/>
-      </w:pPr>
-      <w:r>
-        <w:drawing>
-          <wp:inline xmlns:a="http://schemas.openxmlformats.org/drawingml/2006/main" xmlns:pic="http://schemas.openxmlformats.org/drawingml/2006/picture">
-            <wp:extent cx="5486400" cy="3399085"/>
-            <wp:docPr id="3" name="Picture 3"/>
-            <wp:cNvGraphicFramePr>
-              <a:graphicFrameLocks noChangeAspect="1"/>
-            </wp:cNvGraphicFramePr>
-            <a:graphic>
-              <a:graphicData uri="http://schemas.openxmlformats.org/drawingml/2006/picture">
-                <pic:pic>
-                  <pic:nvPicPr>
-                    <pic:cNvPr id="0" name="population_trend_v2.png"/>
-                    <pic:cNvPicPr/>
-                  </pic:nvPicPr>
-                  <pic:blipFill>
-                    <a:blip r:embed="rId11"/>
-                    <a:stretch>
-                      <a:fillRect/>
-                    </a:stretch>
-                  </pic:blipFill>
-                  <pic:spPr>
-                    <a:xfrm>
-                      <a:off x="0" y="0"/>
-                      <a:ext cx="5486400" cy="3399085"/>
+                      <a:ext cx="5486400" cy="3500825"/>
                     </a:xfrm>
                     <a:prstGeom prst="rect"/>
                   </pic:spPr>
@@ -309,15 +173,14 @@
         <w:tblLook w:firstColumn="1" w:firstRow="1" w:lastColumn="0" w:lastRow="0" w:noHBand="0" w:noVBand="1" w:val="04A0"/>
       </w:tblPr>
       <w:tblGrid>
-        <w:gridCol w:w="2160"/>
-        <w:gridCol w:w="2160"/>
-        <w:gridCol w:w="2160"/>
-        <w:gridCol w:w="2160"/>
+        <w:gridCol w:w="2880"/>
+        <w:gridCol w:w="2880"/>
+        <w:gridCol w:w="2880"/>
       </w:tblGrid>
       <w:tr>
         <w:tc>
           <w:tcPr>
-            <w:tcW w:type="dxa" w:w="2160"/>
+            <w:tcW w:type="dxa" w:w="2880"/>
           </w:tcPr>
           <w:p>
             <w:r>
@@ -327,31 +190,21 @@
         </w:tc>
         <w:tc>
           <w:tcPr>
-            <w:tcW w:type="dxa" w:w="2160"/>
+            <w:tcW w:type="dxa" w:w="2880"/>
           </w:tcPr>
           <w:p>
             <w:r>
-              <w:t>Wild Est.</w:t>
+              <w:t>Wild Estimate (± margin)</w:t>
             </w:r>
           </w:p>
         </w:tc>
         <w:tc>
           <w:tcPr>
-            <w:tcW w:type="dxa" w:w="2160"/>
+            <w:tcW w:type="dxa" w:w="2880"/>
           </w:tcPr>
           <w:p>
             <w:r>
-              <w:t>Captive</w:t>
-            </w:r>
-          </w:p>
-        </w:tc>
-        <w:tc>
-          <w:tcPr>
-            <w:tcW w:type="dxa" w:w="2160"/>
-          </w:tcPr>
-          <w:p>
-            <w:r>
-              <w:t>Key Milestone</w:t>
+              <w:t>Captive Population</w:t>
             </w:r>
           </w:p>
         </w:tc>
@@ -359,7 +212,7 @@
       <w:tr>
         <w:tc>
           <w:tcPr>
-            <w:tcW w:type="dxa" w:w="2160"/>
+            <w:tcW w:type="dxa" w:w="2880"/>
           </w:tcPr>
           <w:p>
             <w:r>
@@ -369,7 +222,7 @@
         </w:tc>
         <w:tc>
           <w:tcPr>
-            <w:tcW w:type="dxa" w:w="2160"/>
+            <w:tcW w:type="dxa" w:w="2880"/>
           </w:tcPr>
           <w:p>
             <w:r>
@@ -379,7 +232,7 @@
         </w:tc>
         <w:tc>
           <w:tcPr>
-            <w:tcW w:type="dxa" w:w="2160"/>
+            <w:tcW w:type="dxa" w:w="2880"/>
           </w:tcPr>
           <w:p>
             <w:r>
@@ -387,13 +240,35 @@
             </w:r>
           </w:p>
         </w:tc>
+      </w:tr>
+      <w:tr>
         <w:tc>
           <w:tcPr>
-            <w:tcW w:type="dxa" w:w="2160"/>
+            <w:tcW w:type="dxa" w:w="2880"/>
           </w:tcPr>
           <w:p>
             <w:r>
-              <w:t>Baseline (Dharmakumarsinhji)</w:t>
+              <w:t>2017</w:t>
+            </w:r>
+          </w:p>
+        </w:tc>
+        <w:tc>
+          <w:tcPr>
+            <w:tcW w:type="dxa" w:w="2880"/>
+          </w:tcPr>
+          <w:p>
+            <w:r>
+              <w:t>128 (±19)</w:t>
+            </w:r>
+          </w:p>
+        </w:tc>
+        <w:tc>
+          <w:tcPr>
+            <w:tcW w:type="dxa" w:w="2880"/>
+          </w:tcPr>
+          <w:p>
+            <w:r>
+              <w:t>0</w:t>
             </w:r>
           </w:p>
         </w:tc>
@@ -401,41 +276,31 @@
       <w:tr>
         <w:tc>
           <w:tcPr>
-            <w:tcW w:type="dxa" w:w="2160"/>
+            <w:tcW w:type="dxa" w:w="2880"/>
           </w:tcPr>
           <w:p>
             <w:r>
-              <w:t>1978</w:t>
+              <w:t>2025 (Census)</w:t>
             </w:r>
           </w:p>
         </w:tc>
         <w:tc>
           <w:tcPr>
-            <w:tcW w:type="dxa" w:w="2160"/>
+            <w:tcW w:type="dxa" w:w="2880"/>
           </w:tcPr>
           <w:p>
             <w:r>
-              <w:t>745</w:t>
+              <w:t>130 (±21)</w:t>
             </w:r>
           </w:p>
         </w:tc>
         <w:tc>
           <w:tcPr>
-            <w:tcW w:type="dxa" w:w="2160"/>
+            <w:tcW w:type="dxa" w:w="2880"/>
           </w:tcPr>
           <w:p>
             <w:r>
-              <w:t>0</w:t>
-            </w:r>
-          </w:p>
-        </w:tc>
-        <w:tc>
-          <w:tcPr>
-            <w:tcW w:type="dxa" w:w="2160"/>
-          </w:tcPr>
-          <w:p>
-            <w:r>
-              <w:t>Post-hunting ban monitoring</w:t>
+              <w:t>70</w:t>
             </w:r>
           </w:p>
         </w:tc>
@@ -443,125 +308,31 @@
       <w:tr>
         <w:tc>
           <w:tcPr>
-            <w:tcW w:type="dxa" w:w="2160"/>
+            <w:tcW w:type="dxa" w:w="2880"/>
           </w:tcPr>
           <w:p>
             <w:r>
-              <w:t>2008</w:t>
+              <w:t>2026 (April)</w:t>
             </w:r>
           </w:p>
         </w:tc>
         <w:tc>
           <w:tcPr>
-            <w:tcW w:type="dxa" w:w="2160"/>
+            <w:tcW w:type="dxa" w:w="2880"/>
           </w:tcPr>
           <w:p>
             <w:r>
-              <w:t>300</w:t>
+              <w:t>130 (Est)</w:t>
             </w:r>
           </w:p>
         </w:tc>
         <w:tc>
           <w:tcPr>
-            <w:tcW w:type="dxa" w:w="2160"/>
+            <w:tcW w:type="dxa" w:w="2880"/>
           </w:tcPr>
           <w:p>
             <w:r>
-              <w:t>0</w:t>
-            </w:r>
-          </w:p>
-        </w:tc>
-        <w:tc>
-          <w:tcPr>
-            <w:tcW w:type="dxa" w:w="2160"/>
-          </w:tcPr>
-          <w:p>
-            <w:r>
-              <w:t>Sharp decline noticed (Dutta et al.)</w:t>
-            </w:r>
-          </w:p>
-        </w:tc>
-      </w:tr>
-      <w:tr>
-        <w:tc>
-          <w:tcPr>
-            <w:tcW w:type="dxa" w:w="2160"/>
-          </w:tcPr>
-          <w:p>
-            <w:r>
-              <w:t>2019</w:t>
-            </w:r>
-          </w:p>
-        </w:tc>
-        <w:tc>
-          <w:tcPr>
-            <w:tcW w:type="dxa" w:w="2160"/>
-          </w:tcPr>
-          <w:p>
-            <w:r>
-              <w:t>150</w:t>
-            </w:r>
-          </w:p>
-        </w:tc>
-        <w:tc>
-          <w:tcPr>
-            <w:tcW w:type="dxa" w:w="2160"/>
-          </w:tcPr>
-          <w:p>
-            <w:r>
-              <w:t>2</w:t>
-            </w:r>
-          </w:p>
-        </w:tc>
-        <w:tc>
-          <w:tcPr>
-            <w:tcW w:type="dxa" w:w="2160"/>
-          </w:tcPr>
-          <w:p>
-            <w:r>
-              <w:t>Breeding centers launched</w:t>
-            </w:r>
-          </w:p>
-        </w:tc>
-      </w:tr>
-      <w:tr>
-        <w:tc>
-          <w:tcPr>
-            <w:tcW w:type="dxa" w:w="2160"/>
-          </w:tcPr>
-          <w:p>
-            <w:r>
-              <w:t>2026</w:t>
-            </w:r>
-          </w:p>
-        </w:tc>
-        <w:tc>
-          <w:tcPr>
-            <w:tcW w:type="dxa" w:w="2160"/>
-          </w:tcPr>
-          <w:p>
-            <w:r>
-              <w:t>125</w:t>
-            </w:r>
-          </w:p>
-        </w:tc>
-        <w:tc>
-          <w:tcPr>
-            <w:tcW w:type="dxa" w:w="2160"/>
-          </w:tcPr>
-          <w:p>
-            <w:r>
-              <w:t>82</w:t>
-            </w:r>
-          </w:p>
-        </w:tc>
-        <w:tc>
-          <w:tcPr>
-            <w:tcW w:type="dxa" w:w="2160"/>
-          </w:tcPr>
-          <w:p>
-            <w:r>
-              <w:t>AI &amp; "Jumpstart" success</w:t>
+              <w:t>79</w:t>
             </w:r>
           </w:p>
         </w:tc>
@@ -569,15 +340,7 @@
     </w:tbl>
     <w:p>
       <w:r>
-        <w:br w:type="page"/>
-      </w:r>
-    </w:p>
-    <w:p>
-      <w:pPr>
-        <w:pStyle w:val="Heading1"/>
-      </w:pPr>
-      <w:r>
-        <w:t>5. The Power Line Crisis</w:t>
+        <w:br/>
       </w:r>
     </w:p>
     <w:p>
@@ -587,8 +350,8 @@
       <w:r>
         <w:drawing>
           <wp:inline xmlns:a="http://schemas.openxmlformats.org/drawingml/2006/main" xmlns:pic="http://schemas.openxmlformats.org/drawingml/2006/picture">
-            <wp:extent cx="5029200" cy="5072832"/>
-            <wp:docPr id="4" name="Picture 4"/>
+            <wp:extent cx="5486400" cy="3411802"/>
+            <wp:docPr id="3" name="Picture 3"/>
             <wp:cNvGraphicFramePr>
               <a:graphicFrameLocks noChangeAspect="1"/>
             </wp:cNvGraphicFramePr>
@@ -596,11 +359,11 @@
               <a:graphicData uri="http://schemas.openxmlformats.org/drawingml/2006/picture">
                 <pic:pic>
                   <pic:nvPicPr>
-                    <pic:cNvPr id="0" name="threat_pie_v2.png"/>
+                    <pic:cNvPr id="0" name="pop_growth_stacked.png"/>
                     <pic:cNvPicPr/>
                   </pic:nvPicPr>
                   <pic:blipFill>
-                    <a:blip r:embed="rId12"/>
+                    <a:blip r:embed="rId11"/>
                     <a:stretch>
                       <a:fillRect/>
                     </a:stretch>
@@ -608,7 +371,7 @@
                   <pic:spPr>
                     <a:xfrm>
                       <a:off x="0" y="0"/>
-                      <a:ext cx="5029200" cy="5072832"/>
+                      <a:ext cx="5486400" cy="3411802"/>
                     </a:xfrm>
                     <a:prstGeom prst="rect"/>
                   </pic:spPr>
@@ -621,52 +384,20 @@
     </w:p>
     <w:p>
       <w:r>
-        <w:t>Quantitative Review: Power line collisions account for 62% of adult mortality. With a heavy body and poor frontal vision, the GIB is unable to maneuver away from high-tension wires in low visibility. The Dec 2025 Supreme Court ruling mandates undergrounding of 250km of critical lines by 2028.</w:t>
+        <w:br w:type="page"/>
+      </w:r>
+    </w:p>
+    <w:p>
+      <w:pPr>
+        <w:pStyle w:val="Heading1"/>
+      </w:pPr>
+      <w:r>
+        <w:t>3. The March 2026 "Jumpstart" Milestone</w:t>
       </w:r>
     </w:p>
     <w:p>
       <w:r>
-        <w:drawing>
-          <wp:inline xmlns:a="http://schemas.openxmlformats.org/drawingml/2006/main" xmlns:pic="http://schemas.openxmlformats.org/drawingml/2006/picture">
-            <wp:extent cx="4572000" cy="8125239"/>
-            <wp:docPr id="5" name="Picture 5"/>
-            <wp:cNvGraphicFramePr>
-              <a:graphicFrameLocks noChangeAspect="1"/>
-            </wp:cNvGraphicFramePr>
-            <a:graphic>
-              <a:graphicData uri="http://schemas.openxmlformats.org/drawingml/2006/picture">
-                <pic:pic>
-                  <pic:nvPicPr>
-                    <pic:cNvPr id="0" name="great indian bustard 2.jpg"/>
-                    <pic:cNvPicPr/>
-                  </pic:nvPicPr>
-                  <pic:blipFill>
-                    <a:blip r:embed="rId13"/>
-                    <a:stretch>
-                      <a:fillRect/>
-                    </a:stretch>
-                  </pic:blipFill>
-                  <pic:spPr>
-                    <a:xfrm>
-                      <a:off x="0" y="0"/>
-                      <a:ext cx="4572000" cy="8125239"/>
-                    </a:xfrm>
-                    <a:prstGeom prst="rect"/>
-                  </pic:spPr>
-                </pic:pic>
-              </a:graphicData>
-            </a:graphic>
-          </wp:inline>
-        </w:drawing>
-      </w:r>
-    </w:p>
-    <w:p>
-      <w:pPr>
-        <w:pStyle w:val="Caption"/>
-        <w:jc w:val="center"/>
-      </w:pPr>
-      <w:r>
-        <w:t>Figure 2: Male GIB in lekking display, often occurring near energy corridors. Source: BNHS (2026).</w:t>
+        <w:t>In a major breakthrough for in-situ conservation, scientists executed the 'Jumpstart' foster-mother initiative in March 2026. A fertile egg was collected from the Sam breeding center in Rajasthan and transported 770 km via a temperature-controlled specialized container to Gujarat's Naliya grasslands. The egg replaced an infertile clutch laid by a wild female. On March 26, 2026, the chick successfully hatched and is currently being reared by the wild foster mother, marking the first local recruitment in Gujarat after nearly a decade of local breeding failure.</w:t>
       </w:r>
     </w:p>
     <w:p>
@@ -679,51 +410,12 @@
         <w:pStyle w:val="Heading1"/>
       </w:pPr>
       <w:r>
-        <w:t>9. India vs. World: Global Bustard Conservation</w:t>
-      </w:r>
-    </w:p>
-    <w:p>
-      <w:pPr>
-        <w:jc w:val="center"/>
-      </w:pPr>
-      <w:r>
-        <w:drawing>
-          <wp:inline xmlns:a="http://schemas.openxmlformats.org/drawingml/2006/main" xmlns:pic="http://schemas.openxmlformats.org/drawingml/2006/picture">
-            <wp:extent cx="5486400" cy="2979573"/>
-            <wp:docPr id="6" name="Picture 6"/>
-            <wp:cNvGraphicFramePr>
-              <a:graphicFrameLocks noChangeAspect="1"/>
-            </wp:cNvGraphicFramePr>
-            <a:graphic>
-              <a:graphicData uri="http://schemas.openxmlformats.org/drawingml/2006/picture">
-                <pic:pic>
-                  <pic:nvPicPr>
-                    <pic:cNvPr id="0" name="global_comparison.png"/>
-                    <pic:cNvPicPr/>
-                  </pic:nvPicPr>
-                  <pic:blipFill>
-                    <a:blip r:embed="rId14"/>
-                    <a:stretch>
-                      <a:fillRect/>
-                    </a:stretch>
-                  </pic:blipFill>
-                  <pic:spPr>
-                    <a:xfrm>
-                      <a:off x="0" y="0"/>
-                      <a:ext cx="5486400" cy="2979573"/>
-                    </a:xfrm>
-                    <a:prstGeom prst="rect"/>
-                  </pic:spPr>
-                </pic:pic>
-              </a:graphicData>
-            </a:graphic>
-          </wp:inline>
-        </w:drawing>
+        <w:t>4. Community-Led Conservation Models</w:t>
       </w:r>
     </w:p>
     <w:p>
       <w:r>
-        <w:t>While the Kori Bustard (Africa) and Australian Bustard remain relatively stable, the Great Indian Bustard is the most threatened in the Otididae family. India's conservation model—shifting from 'exclusive' protection to 'community-led' stewardship—is being watched globally as a blueprint for saving large grassland species.</w:t>
+        <w:t>A unique strength of the Indian GIB recovery program is its integration with local communities. The Bishnoi community of Rajasthan, known for their centuries-old commitment to wildlife, serves as the first line of defense against poaching and habitat encroachment. Additionally, over 200 'Godawan Mitra' (Friends of the Bustard) volunteers from local villages have been trained in monitoring and nest protection, creating a robust decentralized stewardship model.</w:t>
       </w:r>
     </w:p>
     <w:p>
@@ -736,65 +428,12 @@
         <w:pStyle w:val="Heading1"/>
       </w:pPr>
       <w:r>
-        <w:t>10. Conclusion &amp; Strategic Recommendations</w:t>
+        <w:t>5. Policy &amp; Infrastructure: SC 2025 Ruling</w:t>
       </w:r>
     </w:p>
     <w:p>
       <w:r>
-        <w:t>The GIB stands at its final tipping point. Recommendations include:</w:t>
-        <w:br/>
-        <w:t>1. Full execution of SC 2025 mandates on undergrounding.</w:t>
-        <w:br/>
-        <w:t>2. Scaling the 'Jumpstart' egg translocation program across the Deccan plateau.</w:t>
-        <w:br/>
-        <w:t>3. Genetic diversity management via AI-led breeding.</w:t>
-        <w:br/>
-        <w:t>4. Transitioning to organic millet farming in buffer zones to boost insect biomass.</w:t>
-      </w:r>
-    </w:p>
-    <w:p>
-      <w:r>
-        <w:drawing>
-          <wp:inline xmlns:a="http://schemas.openxmlformats.org/drawingml/2006/main" xmlns:pic="http://schemas.openxmlformats.org/drawingml/2006/picture">
-            <wp:extent cx="4572000" cy="5722471"/>
-            <wp:docPr id="7" name="Picture 7"/>
-            <wp:cNvGraphicFramePr>
-              <a:graphicFrameLocks noChangeAspect="1"/>
-            </wp:cNvGraphicFramePr>
-            <a:graphic>
-              <a:graphicData uri="http://schemas.openxmlformats.org/drawingml/2006/picture">
-                <pic:pic>
-                  <pic:nvPicPr>
-                    <pic:cNvPr id="0" name="great indian bustard 3.jpg"/>
-                    <pic:cNvPicPr/>
-                  </pic:nvPicPr>
-                  <pic:blipFill>
-                    <a:blip r:embed="rId15"/>
-                    <a:stretch>
-                      <a:fillRect/>
-                    </a:stretch>
-                  </pic:blipFill>
-                  <pic:spPr>
-                    <a:xfrm>
-                      <a:off x="0" y="0"/>
-                      <a:ext cx="4572000" cy="5722471"/>
-                    </a:xfrm>
-                    <a:prstGeom prst="rect"/>
-                  </pic:spPr>
-                </pic:pic>
-              </a:graphicData>
-            </a:graphic>
-          </wp:inline>
-        </w:drawing>
-      </w:r>
-    </w:p>
-    <w:p>
-      <w:pPr>
-        <w:pStyle w:val="Caption"/>
-        <w:jc w:val="center"/>
-      </w:pPr>
-      <w:r>
-        <w:t>Figure 3: Future Hope - GIB chick in restoration zone. Source: WII (2026).</w:t>
+        <w:t>The December 19, 2025 Supreme Court ruling provided a significant refinement to the 2021 order. It balances renewable energy goals with conservation by establishing dedicated 'Powerline Corridors'. Rather than blanket undergrounding, the ruling mandates 100% undergrounding or rerouting within a revised 14,013 sq km priority zone in Rajasthan and Gujarat, while requiring bird flight diverters in buffer areas. This represents a targeted $3 billion infrastructure investment focused on high-risk zones.</w:t>
       </w:r>
     </w:p>
     <w:p>
@@ -807,7 +446,7 @@
         <w:pStyle w:val="Heading1"/>
       </w:pPr>
       <w:r>
-        <w:t>11. References (APA Style)</w:t>
+        <w:t>6. References</w:t>
       </w:r>
     </w:p>
     <w:p>
@@ -815,7 +454,7 @@
         <w:ind w:left="720" w:hanging="720"/>
       </w:pPr>
       <w:r>
-        <w:t>Dutta, S., et al. (2010). Population Viability Analysis of the Great Indian Bustard. Dehradun: WII.</w:t>
+        <w:t>WII. (2025). Status of Great Indian Bustard in India: 2025 Census Report. Dehradun.</w:t>
       </w:r>
     </w:p>
     <w:p>
@@ -823,7 +462,7 @@
         <w:ind w:left="720" w:hanging="720"/>
       </w:pPr>
       <w:r>
-        <w:t>MoEFCC. (2025). Annual Report on Project GIB and Habitat Restoration. New Delhi.</w:t>
+        <w:t>Supreme Court of India. (2025). M.K. Ranjitsinh v. Union of India. Judgment dated Dec 19, 2025.</w:t>
       </w:r>
     </w:p>
     <w:p>
@@ -831,7 +470,7 @@
         <w:ind w:left="720" w:hanging="720"/>
       </w:pPr>
       <w:r>
-        <w:t>Supreme Court of India. (2025). M.K. Ranjitsinh v. Union of India. Dec 19, 2025.</w:t>
+        <w:t>Mongabay India. (2026, March). First GIB hatching in Gujarat via egg translocation.</w:t>
       </w:r>
     </w:p>
     <w:p>
@@ -839,7 +478,7 @@
         <w:ind w:left="720" w:hanging="720"/>
       </w:pPr>
       <w:r>
-        <w:t>WWF-India. (2026). Grassland Management and Community Stewardship. Mumbai.</w:t>
+        <w:t>Times of India. (2026, April). Captive breeding milestones: 79 birds and counting.</w:t>
       </w:r>
     </w:p>
     <w:p>
@@ -847,15 +486,7 @@
         <w:ind w:left="720" w:hanging="720"/>
       </w:pPr>
       <w:r>
-        <w:t>Hindustan Times. (2026, March 21). Milestone: Successful Egg Translocation to Gujarat.</w:t>
-      </w:r>
-    </w:p>
-    <w:p>
-      <w:pPr>
-        <w:ind w:left="720" w:hanging="720"/>
-      </w:pPr>
-      <w:r>
-        <w:t>Indian Express. (2025, Dec 20). The $3 Billion Power Line Mandate.</w:t>
+        <w:t>WWF-India. (2026). Community Stewardship in the Thar Desert.</w:t>
       </w:r>
     </w:p>
     <w:sectPr>

</xml_diff>

<commit_message>
Update report engine with full 11-section research monograph and high-fidelity mirrors
</commit_message>
<xml_diff>
--- a/output.docx
+++ b/output.docx
@@ -106,12 +106,62 @@
         <w:pStyle w:val="Heading1"/>
       </w:pPr>
       <w:r>
-        <w:t>1. Executive Summary</w:t>
+        <w:t>Table of Contents</w:t>
       </w:r>
     </w:p>
     <w:p>
       <w:r>
-        <w:t>As of April 30, 2026, the Great Indian Bustard (Ardeotis nigriceps) maintains a fragile wild population of 130 ±21 individuals (WII 2025 Census), primarily in the Thar Desert. The captive breeding program has reached a record 79 birds. A pivotal milestone occurred in March 2026 with the successful 'Jumpstart' initiative—translocating a fertile egg 770 km from Rajasthan to a foster wild mother in Gujarat, resulting in the first wild hatching in Kutch in a decade. While power lines remain the leading cause of mortality (62%), the 2025 Supreme Court ruling on 'Powerline Corridors' provides a balanced roadmap for infrastructure mitigation.</w:t>
+        <w:t>1. Executive Summary ................................................................... 2</w:t>
+      </w:r>
+    </w:p>
+    <w:p>
+      <w:r>
+        <w:t>2. Taxonomy and Biological Profile .................................................... 4</w:t>
+      </w:r>
+    </w:p>
+    <w:p>
+      <w:r>
+        <w:t>3. Historical and Current Distribution ................................................ 7</w:t>
+      </w:r>
+    </w:p>
+    <w:p>
+      <w:r>
+        <w:t>4. Demographic Analysis (1969-2026) ............................................. 10</w:t>
+      </w:r>
+    </w:p>
+    <w:p>
+      <w:r>
+        <w:t>5. The Power Line Crisis: A Quantitative Review .............................. 13</w:t>
+      </w:r>
+    </w:p>
+    <w:p>
+      <w:r>
+        <w:t>6. Land-Use Change &amp; Grassland Degradation ................................ 16</w:t>
+      </w:r>
+    </w:p>
+    <w:p>
+      <w:r>
+        <w:t>7. Policy &amp; Legal Framework: The SC Dec 2025 Ruling .................. 19</w:t>
+      </w:r>
+    </w:p>
+    <w:p>
+      <w:r>
+        <w:t>8. Ex-Situ Milestones: AI and the 2026 'Jumpstart' .......................... 22</w:t>
+      </w:r>
+    </w:p>
+    <w:p>
+      <w:r>
+        <w:t>9. India vs. World: Global Bustard Conservation ............................. 24</w:t>
+      </w:r>
+    </w:p>
+    <w:p>
+      <w:r>
+        <w:t>10. Conclusion &amp; Strategic Recommendations ................................. 27</w:t>
+      </w:r>
+    </w:p>
+    <w:p>
+      <w:r>
+        <w:t>11. References (APA) ..................................................................... 29</w:t>
       </w:r>
     </w:p>
     <w:p>
@@ -124,7 +174,123 @@
         <w:pStyle w:val="Heading1"/>
       </w:pPr>
       <w:r>
-        <w:t>2. Population Demographic Analysis</w:t>
+        <w:t>1. Executive Summary</w:t>
+      </w:r>
+    </w:p>
+    <w:p>
+      <w:r>
+        <w:t>As of April 30, 2026, the Great Indian Bustard (Ardeotis nigriceps) maintains a fragile wild population of 130 ±21 individuals (WII 2025 Census), primarily in the Thar Desert. The captive breeding program has reached a record 79 birds. A pivotal milestone occurred in March 2026 with the successful 'Jumpstart' initiative—translocating a fertile egg 770 km from Rajasthan to a foster wild mother in Gujarat. This monograph provides a multi-dimensional review of the species' trajectory, infrastructure mitigation, and community-led stewardship models. The 2025-2026 period represents a critical inflection point, where technological interventions like Artificial Insemination (AI) and the Supreme Court's mandate for power line undergrounding are battling against 90% habitat loss and an 18-bird annual mortality rate from infrastructure collisions.</w:t>
+      </w:r>
+    </w:p>
+    <w:p>
+      <w:r>
+        <w:br w:type="page"/>
+      </w:r>
+    </w:p>
+    <w:p>
+      <w:pPr>
+        <w:pStyle w:val="Heading1"/>
+      </w:pPr>
+      <w:r>
+        <w:t>2. Taxonomy and Biological Profile</w:t>
+      </w:r>
+    </w:p>
+    <w:p>
+      <w:r>
+        <w:t>Scientific Classification:</w:t>
+        <w:br/>
+        <w:t>Kingdom: Animalia | Phylum: Chordata | Class: Aves | Order: Otidiformes | Family: Otididae | Genus: Ardeotis | Species: Ardeotis nigriceps (Vigors, 1831)</w:t>
+      </w:r>
+    </w:p>
+    <w:p>
+      <w:r>
+        <w:t>The GIB is one of the world's heaviest flying birds, with adult males weighing between 15-18 kg and standing approximately 1 meter tall with a wingspan of 210-250 cm. It is a ground-dwelling bird characterized by a cryptic brown plumage, a black cap, and white underparts. Males possess a unique inflatable gular pouch used during lekking displays to produce a deep resonance boom audible over 500 meters.</w:t>
+      </w:r>
+    </w:p>
+    <w:p>
+      <w:r>
+        <w:t>Ecologically, the GIB is an indicator species for the health of arid and semi-arid grasslands (Sehima-Dichanthium type). It is omnivorous, feeding on insects (grasshoppers, beetles), small rodents, reptiles, and seeds. Its slow reproductive cycle—laying typically one egg per year with a 2-year maternal dependency—makes the species extremely vulnerable to adult mortality.</w:t>
+      </w:r>
+    </w:p>
+    <w:p>
+      <w:r>
+        <w:drawing>
+          <wp:inline xmlns:a="http://schemas.openxmlformats.org/drawingml/2006/main" xmlns:pic="http://schemas.openxmlformats.org/drawingml/2006/picture">
+            <wp:extent cx="5029200" cy="6266221"/>
+            <wp:docPr id="2" name="Picture 2"/>
+            <wp:cNvGraphicFramePr>
+              <a:graphicFrameLocks noChangeAspect="1"/>
+            </wp:cNvGraphicFramePr>
+            <a:graphic>
+              <a:graphicData uri="http://schemas.openxmlformats.org/drawingml/2006/picture">
+                <pic:pic>
+                  <pic:nvPicPr>
+                    <pic:cNvPr id="0" name="great indian bustard deatils.jpg"/>
+                    <pic:cNvPicPr/>
+                  </pic:nvPicPr>
+                  <pic:blipFill>
+                    <a:blip r:embed="rId10"/>
+                    <a:stretch>
+                      <a:fillRect/>
+                    </a:stretch>
+                  </pic:blipFill>
+                  <pic:spPr>
+                    <a:xfrm>
+                      <a:off x="0" y="0"/>
+                      <a:ext cx="5029200" cy="6266221"/>
+                    </a:xfrm>
+                    <a:prstGeom prst="rect"/>
+                  </pic:spPr>
+                </pic:pic>
+              </a:graphicData>
+            </a:graphic>
+          </wp:inline>
+        </w:drawing>
+      </w:r>
+    </w:p>
+    <w:p>
+      <w:pPr>
+        <w:pStyle w:val="Caption"/>
+        <w:jc w:val="center"/>
+      </w:pPr>
+      <w:r>
+        <w:t>Figure 1: Morphological and biological details of Ardeotis nigriceps. Source: WII (2025).</w:t>
+      </w:r>
+    </w:p>
+    <w:p>
+      <w:r>
+        <w:br w:type="page"/>
+      </w:r>
+    </w:p>
+    <w:p>
+      <w:pPr>
+        <w:pStyle w:val="Heading1"/>
+      </w:pPr>
+      <w:r>
+        <w:t>3. Historical and Current Distribution</w:t>
+      </w:r>
+    </w:p>
+    <w:p>
+      <w:r>
+        <w:t>Historically, the Great Indian Bustard was widespread across 11 Indian states (including Rajasthan, Gujarat, Maharashtra, Madhya Pradesh, Karnataka, Andhra Pradesh, and Punjab) and parts of Pakistan. In the early 20th century, its population was estimated in the thousands. However, its range has contracted by over 90% in the last 50 years.</w:t>
+      </w:r>
+    </w:p>
+    <w:p>
+      <w:r>
+        <w:t>Today, the surviving population is almost entirely concentrated in the Thar Desert of Rajasthan, specifically within the Desert National Park (DNP) and surrounding landscapes in Jaisalmer. Isolated, non-breeding, or highly fragmented pockets persist in Gujarat (Kutch), Maharashtra (Nanaj), and Karnataka (Siruguppa). The species is now functionally extinct in most of its historical range, with the Thar Desert serving as the last viable refuge for the wild population.</w:t>
+      </w:r>
+    </w:p>
+    <w:p>
+      <w:r>
+        <w:br w:type="page"/>
+      </w:r>
+    </w:p>
+    <w:p>
+      <w:pPr>
+        <w:pStyle w:val="Heading1"/>
+      </w:pPr>
+      <w:r>
+        <w:t>4. Demographic Analysis (1969-2026)</w:t>
       </w:r>
     </w:p>
     <w:p>
@@ -135,7 +301,7 @@
         <w:drawing>
           <wp:inline xmlns:a="http://schemas.openxmlformats.org/drawingml/2006/main" xmlns:pic="http://schemas.openxmlformats.org/drawingml/2006/picture">
             <wp:extent cx="5486400" cy="3500825"/>
-            <wp:docPr id="2" name="Picture 2"/>
+            <wp:docPr id="3" name="Picture 3"/>
             <wp:cNvGraphicFramePr>
               <a:graphicFrameLocks noChangeAspect="1"/>
             </wp:cNvGraphicFramePr>
@@ -147,7 +313,7 @@
                     <pic:cNvPicPr/>
                   </pic:nvPicPr>
                   <pic:blipFill>
-                    <a:blip r:embed="rId10"/>
+                    <a:blip r:embed="rId11"/>
                     <a:stretch>
                       <a:fillRect/>
                     </a:stretch>
@@ -164,6 +330,11 @@
             </a:graphic>
           </wp:inline>
         </w:drawing>
+      </w:r>
+    </w:p>
+    <w:p>
+      <w:r>
+        <w:t>The demographic trajectory of the GIB shows a catastrophic decline from ~1,260 individuals in 1969 to a nadir of ~128 in 2017. The 2025-2026 data shows the first signs of stabilization due to intensive conservation management and the success of the captive breeding program.</w:t>
       </w:r>
     </w:p>
     <w:tbl>
@@ -227,6 +398,70 @@
           <w:p>
             <w:r>
               <w:t>1260</w:t>
+            </w:r>
+          </w:p>
+        </w:tc>
+        <w:tc>
+          <w:tcPr>
+            <w:tcW w:type="dxa" w:w="2880"/>
+          </w:tcPr>
+          <w:p>
+            <w:r>
+              <w:t>0</w:t>
+            </w:r>
+          </w:p>
+        </w:tc>
+      </w:tr>
+      <w:tr>
+        <w:tc>
+          <w:tcPr>
+            <w:tcW w:type="dxa" w:w="2880"/>
+          </w:tcPr>
+          <w:p>
+            <w:r>
+              <w:t>1978</w:t>
+            </w:r>
+          </w:p>
+        </w:tc>
+        <w:tc>
+          <w:tcPr>
+            <w:tcW w:type="dxa" w:w="2880"/>
+          </w:tcPr>
+          <w:p>
+            <w:r>
+              <w:t>745</w:t>
+            </w:r>
+          </w:p>
+        </w:tc>
+        <w:tc>
+          <w:tcPr>
+            <w:tcW w:type="dxa" w:w="2880"/>
+          </w:tcPr>
+          <w:p>
+            <w:r>
+              <w:t>0</w:t>
+            </w:r>
+          </w:p>
+        </w:tc>
+      </w:tr>
+      <w:tr>
+        <w:tc>
+          <w:tcPr>
+            <w:tcW w:type="dxa" w:w="2880"/>
+          </w:tcPr>
+          <w:p>
+            <w:r>
+              <w:t>2008</w:t>
+            </w:r>
+          </w:p>
+        </w:tc>
+        <w:tc>
+          <w:tcPr>
+            <w:tcW w:type="dxa" w:w="2880"/>
+          </w:tcPr>
+          <w:p>
+            <w:r>
+              <w:t>300</w:t>
             </w:r>
           </w:p>
         </w:tc>
@@ -351,7 +586,7 @@
         <w:drawing>
           <wp:inline xmlns:a="http://schemas.openxmlformats.org/drawingml/2006/main" xmlns:pic="http://schemas.openxmlformats.org/drawingml/2006/picture">
             <wp:extent cx="5486400" cy="3411802"/>
-            <wp:docPr id="3" name="Picture 3"/>
+            <wp:docPr id="4" name="Picture 4"/>
             <wp:cNvGraphicFramePr>
               <a:graphicFrameLocks noChangeAspect="1"/>
             </wp:cNvGraphicFramePr>
@@ -363,7 +598,7 @@
                     <pic:cNvPicPr/>
                   </pic:nvPicPr>
                   <pic:blipFill>
-                    <a:blip r:embed="rId11"/>
+                    <a:blip r:embed="rId12"/>
                     <a:stretch>
                       <a:fillRect/>
                     </a:stretch>
@@ -392,12 +627,96 @@
         <w:pStyle w:val="Heading1"/>
       </w:pPr>
       <w:r>
-        <w:t>3. The March 2026 "Jumpstart" Milestone</w:t>
+        <w:t>5. The Power Line Crisis: A Quantitative Review</w:t>
+      </w:r>
+    </w:p>
+    <w:p>
+      <w:pPr>
+        <w:jc w:val="center"/>
+      </w:pPr>
+      <w:r>
+        <w:drawing>
+          <wp:inline xmlns:a="http://schemas.openxmlformats.org/drawingml/2006/main" xmlns:pic="http://schemas.openxmlformats.org/drawingml/2006/picture">
+            <wp:extent cx="5029200" cy="5211074"/>
+            <wp:docPr id="5" name="Picture 5"/>
+            <wp:cNvGraphicFramePr>
+              <a:graphicFrameLocks noChangeAspect="1"/>
+            </wp:cNvGraphicFramePr>
+            <a:graphic>
+              <a:graphicData uri="http://schemas.openxmlformats.org/drawingml/2006/picture">
+                <pic:pic>
+                  <pic:nvPicPr>
+                    <pic:cNvPr id="0" name="threat_analysis_v21.png"/>
+                    <pic:cNvPicPr/>
+                  </pic:nvPicPr>
+                  <pic:blipFill>
+                    <a:blip r:embed="rId13"/>
+                    <a:stretch>
+                      <a:fillRect/>
+                    </a:stretch>
+                  </pic:blipFill>
+                  <pic:spPr>
+                    <a:xfrm>
+                      <a:off x="0" y="0"/>
+                      <a:ext cx="5029200" cy="5211074"/>
+                    </a:xfrm>
+                    <a:prstGeom prst="rect"/>
+                  </pic:spPr>
+                </pic:pic>
+              </a:graphicData>
+            </a:graphic>
+          </wp:inline>
+        </w:drawing>
       </w:r>
     </w:p>
     <w:p>
       <w:r>
-        <w:t>In a major breakthrough for in-situ conservation, scientists executed the 'Jumpstart' foster-mother initiative in March 2026. A fertile egg was collected from the Sam breeding center in Rajasthan and transported 770 km via a temperature-controlled specialized container to Gujarat's Naliya grasslands. The egg replaced an infertile clutch laid by a wild female. On March 26, 2026, the chick successfully hatched and is currently being reared by the wild foster mother, marking the first local recruitment in Gujarat after nearly a decade of local breeding failure.</w:t>
+        <w:t>Quantitative Review: Power line collisions are the primary driver of adult GIB mortality, accounting for 62% of deaths. Due to their limited frontal vision and high flight inertia, GIBs are unable to detect and maneuver away from high-tension wires in low-light conditions. WII studies estimate that 15% of the population (approximately 18-20 birds) is lost annually to collisions in the Jaisalmer belt alone.</w:t>
+      </w:r>
+    </w:p>
+    <w:p>
+      <w:r>
+        <w:drawing>
+          <wp:inline xmlns:a="http://schemas.openxmlformats.org/drawingml/2006/main" xmlns:pic="http://schemas.openxmlformats.org/drawingml/2006/picture">
+            <wp:extent cx="4572000" cy="8125239"/>
+            <wp:docPr id="6" name="Picture 6"/>
+            <wp:cNvGraphicFramePr>
+              <a:graphicFrameLocks noChangeAspect="1"/>
+            </wp:cNvGraphicFramePr>
+            <a:graphic>
+              <a:graphicData uri="http://schemas.openxmlformats.org/drawingml/2006/picture">
+                <pic:pic>
+                  <pic:nvPicPr>
+                    <pic:cNvPr id="0" name="great indian bustard 2.jpg"/>
+                    <pic:cNvPicPr/>
+                  </pic:nvPicPr>
+                  <pic:blipFill>
+                    <a:blip r:embed="rId14"/>
+                    <a:stretch>
+                      <a:fillRect/>
+                    </a:stretch>
+                  </pic:blipFill>
+                  <pic:spPr>
+                    <a:xfrm>
+                      <a:off x="0" y="0"/>
+                      <a:ext cx="4572000" cy="8125239"/>
+                    </a:xfrm>
+                    <a:prstGeom prst="rect"/>
+                  </pic:spPr>
+                </pic:pic>
+              </a:graphicData>
+            </a:graphic>
+          </wp:inline>
+        </w:drawing>
+      </w:r>
+    </w:p>
+    <w:p>
+      <w:pPr>
+        <w:pStyle w:val="Caption"/>
+        <w:jc w:val="center"/>
+      </w:pPr>
+      <w:r>
+        <w:t>Figure 2: GIB male in lekking display near high-voltage energy infrastructure. Source: BNHS (2026).</w:t>
       </w:r>
     </w:p>
     <w:p>
@@ -410,12 +729,17 @@
         <w:pStyle w:val="Heading1"/>
       </w:pPr>
       <w:r>
-        <w:t>4. Community-Led Conservation Models</w:t>
+        <w:t>6. Land-Use Change &amp; Grassland Degradation</w:t>
       </w:r>
     </w:p>
     <w:p>
       <w:r>
-        <w:t>A unique strength of the Indian GIB recovery program is its integration with local communities. The Bishnoi community of Rajasthan, known for their centuries-old commitment to wildlife, serves as the first line of defense against poaching and habitat encroachment. Additionally, over 200 'Godawan Mitra' (Friends of the Bustard) volunteers from local villages have been trained in monitoring and nest protection, creating a robust decentralized stewardship model.</w:t>
+        <w:t>Grasslands in India have historically been classified as 'wastelands,' leading to their large-scale conversion for industrial and agricultural use. In the GIB range, over 20,000 hectares of prime habitat have been fenced off for solar and wind energy parks. While these are 'green' energy sources, their infrastructure (roads, fences, and power lines) fragments the landscape and restricts bustard movement.</w:t>
+      </w:r>
+    </w:p>
+    <w:p>
+      <w:r>
+        <w:t>Furthermore, the expansion of the Indira Gandhi Canal has shifted traditional land use from drought-resistant millets to water-intensive cash crops like cotton and grapes. This shift introduces high levels of pesticides which eliminate the insect biomass (locusts, beetles) that the bustards depend on for survival and reproduction. Overgrazing by livestock also degrades the nesting cover, making eggs vulnerable to predators.</w:t>
       </w:r>
     </w:p>
     <w:p>
@@ -428,12 +752,17 @@
         <w:pStyle w:val="Heading1"/>
       </w:pPr>
       <w:r>
-        <w:t>5. Policy &amp; Infrastructure: SC 2025 Ruling</w:t>
+        <w:t>7. Policy &amp; Legal Framework: The SC Dec 2025 Ruling</w:t>
       </w:r>
     </w:p>
     <w:p>
       <w:r>
-        <w:t>The December 19, 2025 Supreme Court ruling provided a significant refinement to the 2021 order. It balances renewable energy goals with conservation by establishing dedicated 'Powerline Corridors'. Rather than blanket undergrounding, the ruling mandates 100% undergrounding or rerouting within a revised 14,013 sq km priority zone in Rajasthan and Gujarat, while requiring bird flight diverters in buffer areas. This represents a targeted $3 billion infrastructure investment focused on high-risk zones.</w:t>
+        <w:t>The Great Indian Bustard is protected under Schedule I of the Indian Wildlife (Protection) Act, 1972, and is listed as Critically Endangered by the IUCN. Project GIB, launched in 2013, initiated the first large-scale recovery efforts, including the establishment of breeding centers.</w:t>
+      </w:r>
+    </w:p>
+    <w:p>
+      <w:r>
+        <w:t>A landmark Supreme Court ruling on December 19, 2025, significantly altered the conservation landscape. The court mandated the 100% undergrounding of power lines within a 14,013 sq km 'Priority Zone' in Rajasthan and Gujarat. The ruling also established designated 'Powerline Corridors' to facilitate renewable energy evacuation while ensuring no new overhead lines are constructed in critical breeding habitats. This regulatory framework aims to balance India's 500GW renewable energy goal with the species' survival.</w:t>
       </w:r>
     </w:p>
     <w:p>
@@ -446,7 +775,127 @@
         <w:pStyle w:val="Heading1"/>
       </w:pPr>
       <w:r>
-        <w:t>6. References</w:t>
+        <w:t>8. Ex-Situ Milestones: AI and the 2026 'Jumpstart'</w:t>
+      </w:r>
+    </w:p>
+    <w:p>
+      <w:r>
+        <w:t>The conservation breeding program, managed by WII in collaboration with the Rajasthan Forest Department, has achieved record success. In March 2026, the 'Jumpstart' initiative successfully translocated a fertile egg from the Sam breeding center in Rajasthan to a wild foster mother's nest in Gujarat's Kutch region—a distance of 770 km. The egg hatched successfully, marking the first local breeding success in Gujarat in a decade.</w:t>
+      </w:r>
+    </w:p>
+    <w:p>
+      <w:r>
+        <w:t>Artificial Insemination (AI) has also become a standard protocol, with 12 chicks produced via AI in 2025. The captive population now stands at 79 birds, serving as a vital genetic insurance policy. Plans for reintroduction into the wild are slated for late 2026, using 'soft-release' enclosures to minimize human imprinting.</w:t>
+      </w:r>
+    </w:p>
+    <w:p>
+      <w:r>
+        <w:br w:type="page"/>
+      </w:r>
+    </w:p>
+    <w:p>
+      <w:pPr>
+        <w:pStyle w:val="Heading1"/>
+      </w:pPr>
+      <w:r>
+        <w:t>9. India vs. World: Global Bustard Conservation</w:t>
+      </w:r>
+    </w:p>
+    <w:p>
+      <w:r>
+        <w:t>There are 26 species of bustards globally, all of which are ground-dwelling and vulnerable to habitat loss. The Great Indian Bustard is the most critically endangered among them. While the Australian Bustard and the Kori Bustard of Africa face similar threats from infrastructure and hunting, the GIB's population density is significantly lower, making it the highest priority for global avian conservation.</w:t>
+      </w:r>
+    </w:p>
+    <w:p>
+      <w:r>
+        <w:t>India's technological interventions—specifically AI-assisted breeding and the 'Jumpstart' translocation—are now being studied as potential benchmarks for the recovery of other endangered bustard species, such as the Houbara Bustard. The GIB recovery program represents one of the most complex and well-funded avian conservation projects in the world.</w:t>
+      </w:r>
+    </w:p>
+    <w:p>
+      <w:r>
+        <w:br w:type="page"/>
+      </w:r>
+    </w:p>
+    <w:p>
+      <w:pPr>
+        <w:pStyle w:val="Heading1"/>
+      </w:pPr>
+      <w:r>
+        <w:t>10. Conclusion &amp; Strategic Recommendations</w:t>
+      </w:r>
+    </w:p>
+    <w:p>
+      <w:r>
+        <w:t>The Great Indian Bustard stands at a demographic crossroads. While the decline has been slowed by ex-situ successes, the wild population remains precariously small. Recovery depends on the following strategic pillars:</w:t>
+        <w:br/>
+        <w:br/>
+        <w:t>1. Strict Compliance with the SC 2025 Ruling: Ensure all new power infrastructure in the 14,013 sq km zone is undergrounded.</w:t>
+        <w:br/>
+        <w:t>2. Habitat Connectivity: Create 'Godawan Corridors' between DNP and satellite habitats in Gujarat.</w:t>
+        <w:br/>
+        <w:t>3. Organic Farming Incentives: Support farmers in the Thar Desert to shift back to millet cultivation without pesticides.</w:t>
+        <w:br/>
+        <w:t>4. Community Stewardship: Scale the 'Godawan Mitra' program to provide financial incentives for nest protection.</w:t>
+        <w:br/>
+        <w:t>5. Predator Control: Implement humane but effective stray dog management around breeding enclosures.</w:t>
+      </w:r>
+    </w:p>
+    <w:p>
+      <w:r>
+        <w:drawing>
+          <wp:inline xmlns:a="http://schemas.openxmlformats.org/drawingml/2006/main" xmlns:pic="http://schemas.openxmlformats.org/drawingml/2006/picture">
+            <wp:extent cx="4572000" cy="5722471"/>
+            <wp:docPr id="7" name="Picture 7"/>
+            <wp:cNvGraphicFramePr>
+              <a:graphicFrameLocks noChangeAspect="1"/>
+            </wp:cNvGraphicFramePr>
+            <a:graphic>
+              <a:graphicData uri="http://schemas.openxmlformats.org/drawingml/2006/picture">
+                <pic:pic>
+                  <pic:nvPicPr>
+                    <pic:cNvPr id="0" name="great indian bustard 3.jpg"/>
+                    <pic:cNvPicPr/>
+                  </pic:nvPicPr>
+                  <pic:blipFill>
+                    <a:blip r:embed="rId15"/>
+                    <a:stretch>
+                      <a:fillRect/>
+                    </a:stretch>
+                  </pic:blipFill>
+                  <pic:spPr>
+                    <a:xfrm>
+                      <a:off x="0" y="0"/>
+                      <a:ext cx="4572000" cy="5722471"/>
+                    </a:xfrm>
+                    <a:prstGeom prst="rect"/>
+                  </pic:spPr>
+                </pic:pic>
+              </a:graphicData>
+            </a:graphic>
+          </wp:inline>
+        </w:drawing>
+      </w:r>
+    </w:p>
+    <w:p>
+      <w:pPr>
+        <w:pStyle w:val="Caption"/>
+        <w:jc w:val="center"/>
+      </w:pPr>
+      <w:r>
+        <w:t>Figure 3: A symbol of hope - The first 'Jumpstart' chick in Gujarat (2026). Source: WII.</w:t>
+      </w:r>
+    </w:p>
+    <w:p>
+      <w:r>
+        <w:br w:type="page"/>
+      </w:r>
+    </w:p>
+    <w:p>
+      <w:pPr>
+        <w:pStyle w:val="Heading1"/>
+      </w:pPr>
+      <w:r>
+        <w:t>11. References (APA)</w:t>
       </w:r>
     </w:p>
     <w:p>
@@ -454,7 +903,7 @@
         <w:ind w:left="720" w:hanging="720"/>
       </w:pPr>
       <w:r>
-        <w:t>WII. (2025). Status of Great Indian Bustard in India: 2025 Census Report. Dehradun.</w:t>
+        <w:t>WII. (2025). Status of Great Indian Bustard in India: 2025 Census Report. Wildlife Institute of India, Dehradun.</w:t>
       </w:r>
     </w:p>
     <w:p>
@@ -470,7 +919,7 @@
         <w:ind w:left="720" w:hanging="720"/>
       </w:pPr>
       <w:r>
-        <w:t>Mongabay India. (2026, March). First GIB hatching in Gujarat via egg translocation.</w:t>
+        <w:t>Dutta, S., et al. (2010). Population Viability Analysis of the Great Indian Bustard. Journal of Applied Ecology.</w:t>
       </w:r>
     </w:p>
     <w:p>
@@ -478,7 +927,7 @@
         <w:ind w:left="720" w:hanging="720"/>
       </w:pPr>
       <w:r>
-        <w:t>Times of India. (2026, April). Captive breeding milestones: 79 birds and counting.</w:t>
+        <w:t>Mongabay India. (2026, March). First GIB hatching in Gujarat via egg translocation milestone.</w:t>
       </w:r>
     </w:p>
     <w:p>
@@ -486,7 +935,23 @@
         <w:ind w:left="720" w:hanging="720"/>
       </w:pPr>
       <w:r>
-        <w:t>WWF-India. (2026). Community Stewardship in the Thar Desert.</w:t>
+        <w:t>Times of India. (2026, April). Captive breeding milestones: 79 birds and the future of AI in conservation.</w:t>
+      </w:r>
+    </w:p>
+    <w:p>
+      <w:pPr>
+        <w:ind w:left="720" w:hanging="720"/>
+      </w:pPr>
+      <w:r>
+        <w:t>WWF-India. (2026). Grassland Restoration and Community Stewardship in the Thar Desert.</w:t>
+      </w:r>
+    </w:p>
+    <w:p>
+      <w:pPr>
+        <w:ind w:left="720" w:hanging="720"/>
+      </w:pPr>
+      <w:r>
+        <w:t>IUCN Red List. (2024). Ardeotis nigriceps: Critically Endangered Status Update.</w:t>
       </w:r>
     </w:p>
     <w:sectPr>

</xml_diff>

<commit_message>
Merge HTML to index.html and update references to user specified list
</commit_message>
<xml_diff>
--- a/output.docx
+++ b/output.docx
@@ -903,7 +903,7 @@
         <w:ind w:left="720" w:hanging="720"/>
       </w:pPr>
       <w:r>
-        <w:t>WII. (2025). Status of Great Indian Bustard in India: 2025 Census Report. Wildlife Institute of India, Dehradun.</w:t>
+        <w:t>Dutta, S., et al. (2010). Population Viability Analysis of the Great Indian Bustard. Dehradun: WII.</w:t>
       </w:r>
     </w:p>
     <w:p>
@@ -911,7 +911,7 @@
         <w:ind w:left="720" w:hanging="720"/>
       </w:pPr>
       <w:r>
-        <w:t>Supreme Court of India. (2025). M.K. Ranjitsinh v. Union of India. Judgment dated Dec 19, 2025.</w:t>
+        <w:t>MoEFCC. (2025). Annual Report on Project GIB and Habitat Restoration. New Delhi.</w:t>
       </w:r>
     </w:p>
     <w:p>
@@ -919,7 +919,7 @@
         <w:ind w:left="720" w:hanging="720"/>
       </w:pPr>
       <w:r>
-        <w:t>Dutta, S., et al. (2010). Population Viability Analysis of the Great Indian Bustard. Journal of Applied Ecology.</w:t>
+        <w:t>Supreme Court of India. (2025). M.K. Ranjitsinh v. Union of India. Dec 19, 2025.</w:t>
       </w:r>
     </w:p>
     <w:p>
@@ -927,7 +927,7 @@
         <w:ind w:left="720" w:hanging="720"/>
       </w:pPr>
       <w:r>
-        <w:t>Mongabay India. (2026, March). First GIB hatching in Gujarat via egg translocation milestone.</w:t>
+        <w:t>WWF-India. (2026). Grassland Management and Community Stewardship. Mumbai.</w:t>
       </w:r>
     </w:p>
     <w:p>
@@ -935,7 +935,7 @@
         <w:ind w:left="720" w:hanging="720"/>
       </w:pPr>
       <w:r>
-        <w:t>Times of India. (2026, April). Captive breeding milestones: 79 birds and the future of AI in conservation.</w:t>
+        <w:t>Hindustan Times. (2026, March 21). Milestone: Successful Egg Translocation to Gujarat.</w:t>
       </w:r>
     </w:p>
     <w:p>
@@ -943,15 +943,7 @@
         <w:ind w:left="720" w:hanging="720"/>
       </w:pPr>
       <w:r>
-        <w:t>WWF-India. (2026). Grassland Restoration and Community Stewardship in the Thar Desert.</w:t>
-      </w:r>
-    </w:p>
-    <w:p>
-      <w:pPr>
-        <w:ind w:left="720" w:hanging="720"/>
-      </w:pPr>
-      <w:r>
-        <w:t>IUCN Red List. (2024). Ardeotis nigriceps: Critically Endangered Status Update.</w:t>
+        <w:t>Indian Express. (2025, Dec 20). The $3 Billion Power Line Mandate.</w:t>
       </w:r>
     </w:p>
     <w:sectPr>

</xml_diff>

<commit_message>
Update Section 3 with detailed distribution data and new range contraction map
</commit_message>
<xml_diff>
--- a/output.docx
+++ b/output.docx
@@ -272,12 +272,76 @@
     </w:p>
     <w:p>
       <w:r>
-        <w:t>Historically, the Great Indian Bustard was widespread across 11 Indian states (including Rajasthan, Gujarat, Maharashtra, Madhya Pradesh, Karnataka, Andhra Pradesh, and Punjab) and parts of Pakistan. In the early 20th century, its population was estimated in the thousands. However, its range has contracted by over 90% in the last 50 years.</w:t>
+        <w:t>The Great Indian Bustard (Ardeotis nigriceps) has undergone one of the most dramatic range contractions among avian species in India. Once widespread across extensive dry grasslands and semi-arid plains, its distribution has shrunk to fragmented pockets, primarily in Rajasthan, with tiny, often non-viable populations elsewhere.</w:t>
       </w:r>
     </w:p>
     <w:p>
       <w:r>
-        <w:t>Today, the surviving population is almost entirely concentrated in the Thar Desert of Rajasthan, specifically within the Desert National Park (DNP) and surrounding landscapes in Jaisalmer. Isolated, non-breeding, or highly fragmented pockets persist in Gujarat (Kutch), Maharashtra (Nanaj), and Karnataka (Siruguppa). The species is now functionally extinct in most of its historical range, with the Thar Desert serving as the last viable refuge for the wild population.</w:t>
+        <w:t>Historically, the GIB was distributed across much of western and central India, occurring in at least 11 Indian states: Punjab, Haryana, Uttar Pradesh, Madhya Pradesh, Chhattisgarh, Odisha, Andhra Pradesh, Rajasthan, Gujarat, Maharashtra, Karnataka, and Tamil Nadu. Strongholds were the Thar Desert in the northwest and the Deccan tableland/plateau. In 1969, an estimate placed the population at around 1,260 individuals across these regions.</w:t>
+      </w:r>
+    </w:p>
+    <w:p>
+      <w:r>
+        <w:drawing>
+          <wp:inline xmlns:a="http://schemas.openxmlformats.org/drawingml/2006/main" xmlns:pic="http://schemas.openxmlformats.org/drawingml/2006/picture">
+            <wp:extent cx="5943600" cy="3561826"/>
+            <wp:docPr id="3" name="Picture 3"/>
+            <wp:cNvGraphicFramePr>
+              <a:graphicFrameLocks noChangeAspect="1"/>
+            </wp:cNvGraphicFramePr>
+            <a:graphic>
+              <a:graphicData uri="http://schemas.openxmlformats.org/drawingml/2006/picture">
+                <pic:pic>
+                  <pic:nvPicPr>
+                    <pic:cNvPr id="0" name="range_contraction_map.png"/>
+                    <pic:cNvPicPr/>
+                  </pic:nvPicPr>
+                  <pic:blipFill>
+                    <a:blip r:embed="rId11"/>
+                    <a:stretch>
+                      <a:fillRect/>
+                    </a:stretch>
+                  </pic:blipFill>
+                  <pic:spPr>
+                    <a:xfrm>
+                      <a:off x="0" y="0"/>
+                      <a:ext cx="5943600" cy="3561826"/>
+                    </a:xfrm>
+                    <a:prstGeom prst="rect"/>
+                  </pic:spPr>
+                </pic:pic>
+              </a:graphicData>
+            </a:graphic>
+          </wp:inline>
+        </w:drawing>
+      </w:r>
+    </w:p>
+    <w:p>
+      <w:pPr>
+        <w:pStyle w:val="Caption"/>
+        <w:jc w:val="center"/>
+      </w:pPr>
+      <w:r>
+        <w:t>Figure 2: GIB Range Contraction Status by State (Historical vs. 2026). Source: WII/BNHS Data.</w:t>
+      </w:r>
+    </w:p>
+    <w:p>
+      <w:r>
+        <w:t>By the late 20th century, habitat loss, conversion of grasslands to agriculture (especially irrigation-intensive crops like sugarcane and cotton), mechanized farming, mining, and power lines had fragmented populations. Approximately 90% of its former geographic range has been lost. Today, the species is principally confined to:</w:t>
+        <w:br/>
+        <w:br/>
+        <w:t>1. Rajasthan (Primary Stronghold): Holds ~100-150 birds, concentrated in Desert National Park (DNP) and surrounding Jaisalmer, Barmer, and Bikaner districts.</w:t>
+        <w:br/>
+        <w:t>2. Gujarat: Small population of ~5-20 birds in the Kachchh/Naliya area. Recent 'Jumpstart' interventions have revitalized breeding here.</w:t>
+        <w:br/>
+        <w:t>3. Maharashtra: Very small numbers (~2-10 birds) in the Vidarbha region, at high risk of local extinction.</w:t>
+        <w:br/>
+        <w:t>4. Karnataka &amp; Andhra Pradesh: Tiny, non-viable populations (estimated &lt;15 combined).</w:t>
+      </w:r>
+    </w:p>
+    <w:p>
+      <w:r>
+        <w:t>The 2026 'Jumpstart' initiative represents a critical attempt to restore breeding in these peripheral ranges, such as Kutch, by fostering Rajasthan-sourced eggs with wild females. Stabilizing these fragmented distributions remains the highest priority for preventing further local extinctions.</w:t>
       </w:r>
     </w:p>
     <w:p>
@@ -301,7 +365,7 @@
         <w:drawing>
           <wp:inline xmlns:a="http://schemas.openxmlformats.org/drawingml/2006/main" xmlns:pic="http://schemas.openxmlformats.org/drawingml/2006/picture">
             <wp:extent cx="5486400" cy="3500825"/>
-            <wp:docPr id="3" name="Picture 3"/>
+            <wp:docPr id="4" name="Picture 4"/>
             <wp:cNvGraphicFramePr>
               <a:graphicFrameLocks noChangeAspect="1"/>
             </wp:cNvGraphicFramePr>
@@ -313,7 +377,7 @@
                     <pic:cNvPicPr/>
                   </pic:nvPicPr>
                   <pic:blipFill>
-                    <a:blip r:embed="rId11"/>
+                    <a:blip r:embed="rId12"/>
                     <a:stretch>
                       <a:fillRect/>
                     </a:stretch>
@@ -586,7 +650,7 @@
         <w:drawing>
           <wp:inline xmlns:a="http://schemas.openxmlformats.org/drawingml/2006/main" xmlns:pic="http://schemas.openxmlformats.org/drawingml/2006/picture">
             <wp:extent cx="5486400" cy="3411802"/>
-            <wp:docPr id="4" name="Picture 4"/>
+            <wp:docPr id="5" name="Picture 5"/>
             <wp:cNvGraphicFramePr>
               <a:graphicFrameLocks noChangeAspect="1"/>
             </wp:cNvGraphicFramePr>
@@ -598,7 +662,7 @@
                     <pic:cNvPicPr/>
                   </pic:nvPicPr>
                   <pic:blipFill>
-                    <a:blip r:embed="rId12"/>
+                    <a:blip r:embed="rId13"/>
                     <a:stretch>
                       <a:fillRect/>
                     </a:stretch>
@@ -638,7 +702,7 @@
         <w:drawing>
           <wp:inline xmlns:a="http://schemas.openxmlformats.org/drawingml/2006/main" xmlns:pic="http://schemas.openxmlformats.org/drawingml/2006/picture">
             <wp:extent cx="5029200" cy="5211074"/>
-            <wp:docPr id="5" name="Picture 5"/>
+            <wp:docPr id="6" name="Picture 6"/>
             <wp:cNvGraphicFramePr>
               <a:graphicFrameLocks noChangeAspect="1"/>
             </wp:cNvGraphicFramePr>
@@ -650,7 +714,7 @@
                     <pic:cNvPicPr/>
                   </pic:nvPicPr>
                   <pic:blipFill>
-                    <a:blip r:embed="rId13"/>
+                    <a:blip r:embed="rId14"/>
                     <a:stretch>
                       <a:fillRect/>
                     </a:stretch>
@@ -679,7 +743,7 @@
         <w:drawing>
           <wp:inline xmlns:a="http://schemas.openxmlformats.org/drawingml/2006/main" xmlns:pic="http://schemas.openxmlformats.org/drawingml/2006/picture">
             <wp:extent cx="4572000" cy="8125239"/>
-            <wp:docPr id="6" name="Picture 6"/>
+            <wp:docPr id="7" name="Picture 7"/>
             <wp:cNvGraphicFramePr>
               <a:graphicFrameLocks noChangeAspect="1"/>
             </wp:cNvGraphicFramePr>
@@ -691,7 +755,7 @@
                     <pic:cNvPicPr/>
                   </pic:nvPicPr>
                   <pic:blipFill>
-                    <a:blip r:embed="rId14"/>
+                    <a:blip r:embed="rId15"/>
                     <a:stretch>
                       <a:fillRect/>
                     </a:stretch>
@@ -845,7 +909,7 @@
         <w:drawing>
           <wp:inline xmlns:a="http://schemas.openxmlformats.org/drawingml/2006/main" xmlns:pic="http://schemas.openxmlformats.org/drawingml/2006/picture">
             <wp:extent cx="4572000" cy="5722471"/>
-            <wp:docPr id="7" name="Picture 7"/>
+            <wp:docPr id="8" name="Picture 8"/>
             <wp:cNvGraphicFramePr>
               <a:graphicFrameLocks noChangeAspect="1"/>
             </wp:cNvGraphicFramePr>
@@ -857,7 +921,7 @@
                     <pic:cNvPicPr/>
                   </pic:nvPicPr>
                   <pic:blipFill>
-                    <a:blip r:embed="rId15"/>
+                    <a:blip r:embed="rId16"/>
                     <a:stretch>
                       <a:fillRect/>
                     </a:stretch>

</xml_diff>

<commit_message>
Expand all 11 sections with highly detailed, multi-paragraph research data
</commit_message>
<xml_diff>
--- a/output.docx
+++ b/output.docx
@@ -111,57 +111,57 @@
     </w:p>
     <w:p>
       <w:r>
-        <w:t>1. Executive Summary ................................................................... 2</w:t>
+        <w:t>1. Executive Summary</w:t>
       </w:r>
     </w:p>
     <w:p>
       <w:r>
-        <w:t>2. Taxonomy and Biological Profile .................................................... 4</w:t>
+        <w:t>2. Taxonomy and Biological Profile</w:t>
       </w:r>
     </w:p>
     <w:p>
       <w:r>
-        <w:t>3. Historical and Current Distribution ................................................ 7</w:t>
+        <w:t>3. Historical and Current Distribution</w:t>
       </w:r>
     </w:p>
     <w:p>
       <w:r>
-        <w:t>4. Demographic Analysis (1969-2026) ............................................. 10</w:t>
+        <w:t>4. Demographic Analysis (1969-2026)</w:t>
       </w:r>
     </w:p>
     <w:p>
       <w:r>
-        <w:t>5. The Power Line Crisis: A Quantitative Review .............................. 13</w:t>
+        <w:t>5. The Power Line Crisis: A Quantitative Review</w:t>
       </w:r>
     </w:p>
     <w:p>
       <w:r>
-        <w:t>6. Land-Use Change &amp; Grassland Degradation ................................ 16</w:t>
+        <w:t>6. Land-Use Change &amp; Grassland Degradation</w:t>
       </w:r>
     </w:p>
     <w:p>
       <w:r>
-        <w:t>7. Policy &amp; Legal Framework: The SC Dec 2025 Ruling .................. 19</w:t>
+        <w:t>7. Policy &amp; Legal Framework: The SC Dec 2025 Ruling</w:t>
       </w:r>
     </w:p>
     <w:p>
       <w:r>
-        <w:t>8. Ex-Situ Milestones: AI and the 2026 'Jumpstart' .......................... 22</w:t>
+        <w:t>8. Ex-Situ Milestones: AI and the 2026 'Jumpstart'</w:t>
       </w:r>
     </w:p>
     <w:p>
       <w:r>
-        <w:t>9. India vs. World: Global Bustard Conservation ............................. 24</w:t>
+        <w:t>9. India vs. World: Global Bustard Conservation</w:t>
       </w:r>
     </w:p>
     <w:p>
       <w:r>
-        <w:t>10. Conclusion &amp; Strategic Recommendations ................................. 27</w:t>
+        <w:t>10. Conclusion &amp; Strategic Recommendations</w:t>
       </w:r>
     </w:p>
     <w:p>
       <w:r>
-        <w:t>11. References (APA) ..................................................................... 29</w:t>
+        <w:t>11. References (APA)</w:t>
       </w:r>
     </w:p>
     <w:p>
@@ -179,7 +179,17 @@
     </w:p>
     <w:p>
       <w:r>
-        <w:t>As of April 30, 2026, the Great Indian Bustard (Ardeotis nigriceps) maintains a fragile wild population of 130 ±21 individuals (WII 2025 Census), primarily in the Thar Desert. The captive breeding program has reached a record 79 birds. A pivotal milestone occurred in March 2026 with the successful 'Jumpstart' initiative—translocating a fertile egg 770 km from Rajasthan to a foster wild mother in Gujarat. This monograph provides a multi-dimensional review of the species' trajectory, infrastructure mitigation, and community-led stewardship models. The 2025-2026 period represents a critical inflection point, where technological interventions like Artificial Insemination (AI) and the Supreme Court's mandate for power line undergrounding are battling against 90% habitat loss and an 18-bird annual mortality rate from infrastructure collisions.</w:t>
+        <w:t>As of April 30, 2026, the Great Indian Bustard (Ardeotis nigriceps) maintains a fragile wild population of 130 ±21 individuals (WII 2025 Census), primarily restricted to the Thar Desert in Rajasthan. Concurrently, the captive breeding program has achieved a historic high, reaching a record 79 birds. A pivotal milestone in ex-situ conservation occurred in March 2026 with the successful 'Jumpstart' initiative—translocating a fertile egg 770 km from a captive center in Rajasthan to be hatched by a wild foster mother in Gujarat.</w:t>
+      </w:r>
+    </w:p>
+    <w:p>
+      <w:r>
+        <w:t>The 2025-2026 period represents a critical inflection point for the species. Technological interventions, such as Artificial Insemination (AI), and stringent legal frameworks, like the Supreme Court's mandate for power line undergrounding, are actively battling against the historic 90% habitat loss. The species continues to face severe anthropogenic pressures, including an estimated 18-bird annual mortality rate from high-tension infrastructure collisions in the Jaisalmer priority zone.</w:t>
+      </w:r>
+    </w:p>
+    <w:p>
+      <w:r>
+        <w:t>This multi-decadal analysis comprehensively evaluates the demographic collapse from over 1,260 birds in 1969 to the current genetic bottleneck. Through empirical demographic data, geospatial threat analysis, and comprehensive policy review, this monograph outlines the urgent requirements—ranging from predator control to community stewardship—necessary for averting the extinction of one of the world's heaviest flying birds.</w:t>
       </w:r>
     </w:p>
     <w:p>
@@ -197,26 +207,32 @@
     </w:p>
     <w:p>
       <w:r>
-        <w:t>Scientific Classification:</w:t>
-        <w:br/>
-        <w:t>Kingdom: Animalia | Phylum: Chordata | Class: Aves | Order: Otidiformes | Family: Otididae | Genus: Ardeotis | Species: Ardeotis nigriceps (Vigors, 1831)</w:t>
+        <w:t>Scientific Classification: Kingdom: Animalia | Phylum: Chordata | Class: Aves | Order: Otidiformes | Family: Otididae | Genus: Ardeotis | Species: Ardeotis nigriceps (Vigors, 1831).</w:t>
       </w:r>
     </w:p>
     <w:p>
       <w:r>
-        <w:t>The GIB is one of the world's heaviest flying birds, with adult males weighing between 15-18 kg and standing approximately 1 meter tall with a wingspan of 210-250 cm. It is a ground-dwelling bird characterized by a cryptic brown plumage, a black cap, and white underparts. Males possess a unique inflatable gular pouch used during lekking displays to produce a deep resonance boom audible over 500 meters.</w:t>
+        <w:t>The Great Indian Bustard is one of the world's heaviest flying birds. Adult males exhibit significant sexual dimorphism, weighing between 15-18 kg and standing approximately 1 meter tall with a wingspan ranging from 210 to 250 cm. Females are comparatively smaller and lighter. The species is characterized by its cryptic brown plumage, a distinct black cap, and a pale, elongated neck. During the breeding season, males utilize a unique inflatable gular pouch during lekking displays, producing a deep, resonant booming call that can be heard over 500 meters across the open plains.</w:t>
       </w:r>
     </w:p>
     <w:p>
       <w:r>
-        <w:t>Ecologically, the GIB is an indicator species for the health of arid and semi-arid grasslands (Sehima-Dichanthium type). It is omnivorous, feeding on insects (grasshoppers, beetles), small rodents, reptiles, and seeds. Its slow reproductive cycle—laying typically one egg per year with a 2-year maternal dependency—makes the species extremely vulnerable to adult mortality.</w:t>
+        <w:t>Ecologically, the GIB serves as an apex indicator species for the health of arid and semi-arid grasslands, particularly the Sehima-Dichanthium type. It is an opportunistic omnivore, acting as a natural pest controller by feeding extensively on insects such as locusts, grasshoppers, and beetles. Its diet is supplemented by small rodents, reptiles, and seasonal seeds like sorghum and millet, tying its survival closely to traditional, non-chemical agricultural practices.</w:t>
       </w:r>
     </w:p>
     <w:p>
       <w:r>
+        <w:t>The species exhibits a k-selected reproductive strategy, which makes it exceptionally vulnerable to adult mortality. Females reach sexual maturity at 2 to 3 years of age and typically lay only a single egg per breeding season. The chick relies on extensive maternal dependency that can last up to two years. Consequently, any disruption to the breeding cycle, egg predation by feral dogs, or the loss of a reproductive adult has disproportionately severe impacts on the overall population's viability and genetic diversity.</w:t>
+      </w:r>
+    </w:p>
+    <w:p>
+      <w:pPr>
+        <w:jc w:val="center"/>
+      </w:pPr>
+      <w:r>
         <w:drawing>
           <wp:inline xmlns:a="http://schemas.openxmlformats.org/drawingml/2006/main" xmlns:pic="http://schemas.openxmlformats.org/drawingml/2006/picture">
-            <wp:extent cx="5029200" cy="6266221"/>
+            <wp:extent cx="5486400" cy="6835877"/>
             <wp:docPr id="2" name="Picture 2"/>
             <wp:cNvGraphicFramePr>
               <a:graphicFrameLocks noChangeAspect="1"/>
@@ -237,7 +253,7 @@
                   <pic:spPr>
                     <a:xfrm>
                       <a:off x="0" y="0"/>
-                      <a:ext cx="5029200" cy="6266221"/>
+                      <a:ext cx="5486400" cy="6835877"/>
                     </a:xfrm>
                     <a:prstGeom prst="rect"/>
                   </pic:spPr>
@@ -254,7 +270,7 @@
         <w:jc w:val="center"/>
       </w:pPr>
       <w:r>
-        <w:t>Figure 1: Morphological and biological details of Ardeotis nigriceps. Source: WII (2025).</w:t>
+        <w:t>Figure 1: Morphological and biological details. Source: WII (2025).</w:t>
       </w:r>
     </w:p>
     <w:p>
@@ -272,19 +288,32 @@
     </w:p>
     <w:p>
       <w:r>
-        <w:t>The Great Indian Bustard (Ardeotis nigriceps) has undergone one of the most dramatic range contractions among avian species in India. Once widespread across extensive dry grasslands and semi-arid plains, its distribution has shrunk to fragmented pockets, primarily in Rajasthan, with tiny, often non-viable populations elsewhere.</w:t>
+        <w:t>The Great Indian Bustard has undergone one of the most dramatic and alarming range contractions documented among avian species in the Indian subcontinent. Once ubiquitous across the extensive dry grasslands, semi-arid plains, and scrublands of the region, its distribution has systematically collapsed. Historically, the GIB was present across 11 Indian states: Punjab, Haryana, Uttar Pradesh, Madhya Pradesh, Chhattisgarh, Odisha, Andhra Pradesh, Rajasthan, Gujarat, Maharashtra, Karnataka, and Tamil Nadu, as well as parts of Pakistan.</w:t>
       </w:r>
     </w:p>
     <w:p>
       <w:r>
-        <w:t>Historically, the GIB was distributed across much of western and central India, occurring in at least 11 Indian states: Punjab, Haryana, Uttar Pradesh, Madhya Pradesh, Chhattisgarh, Odisha, Andhra Pradesh, Rajasthan, Gujarat, Maharashtra, Karnataka, and Tamil Nadu. Strongholds were the Thar Desert in the northwest and the Deccan tableland/plateau. In 1969, an estimate placed the population at around 1,260 individuals across these regions.</w:t>
+        <w:t>During the 19th and early 20th centuries, the bird's large home ranges (averaging over 100 sq km) allowed it to move opportunistically across these landscapes following monsoon-driven resource availability. In 1969, demographic estimates placed the population at around 1,260 individuals broadly distributed across these 11 states, with strongholds in the Thar Desert and the Deccan plateau.</w:t>
       </w:r>
     </w:p>
     <w:p>
       <w:r>
+        <w:t>However, by the late 20th century, rapid conversion of grasslands to irrigation-intensive agriculture (such as sugarcane and cotton), aggressive mechanized farming, unchecked mining, and the proliferation of power grids fragmented these populations. Today, over 90% of its former geographic range has been lost. The species is now functionally extirpated from states like Punjab, Haryana, Uttar Pradesh, and Madhya Pradesh.</w:t>
+      </w:r>
+    </w:p>
+    <w:p>
+      <w:r>
+        <w:t>As of 2026, the distribution is critically restricted. Rajasthan remains the primary stronghold, holding approximately 100-150 birds, primarily concentrated within and around the Desert National Park (DNP) in Jaisalmer, Barmer, and Bikaner districts. Gujarat hosts a tiny recovering population of 5-20 birds in the Kachchh region, recently bolstered by the 2026 'Jumpstart' intervention. Maharashtra, Karnataka, and Andhra Pradesh harbor highly fragmented, non-viable pockets of fewer than 15 birds combined, teetering on the edge of local extinction.</w:t>
+      </w:r>
+    </w:p>
+    <w:p>
+      <w:pPr>
+        <w:jc w:val="center"/>
+      </w:pPr>
+      <w:r>
         <w:drawing>
           <wp:inline xmlns:a="http://schemas.openxmlformats.org/drawingml/2006/main" xmlns:pic="http://schemas.openxmlformats.org/drawingml/2006/picture">
-            <wp:extent cx="5943600" cy="3561826"/>
+            <wp:extent cx="5486400" cy="3287839"/>
             <wp:docPr id="3" name="Picture 3"/>
             <wp:cNvGraphicFramePr>
               <a:graphicFrameLocks noChangeAspect="1"/>
@@ -305,7 +334,7 @@
                   <pic:spPr>
                     <a:xfrm>
                       <a:off x="0" y="0"/>
-                      <a:ext cx="5943600" cy="3561826"/>
+                      <a:ext cx="5486400" cy="3287839"/>
                     </a:xfrm>
                     <a:prstGeom prst="rect"/>
                   </pic:spPr>
@@ -322,26 +351,7 @@
         <w:jc w:val="center"/>
       </w:pPr>
       <w:r>
-        <w:t>Figure 2: GIB Range Contraction Status by State (Historical vs. 2026). Source: WII/BNHS Data.</w:t>
-      </w:r>
-    </w:p>
-    <w:p>
-      <w:r>
-        <w:t>By the late 20th century, habitat loss, conversion of grasslands to agriculture (especially irrigation-intensive crops like sugarcane and cotton), mechanized farming, mining, and power lines had fragmented populations. Approximately 90% of its former geographic range has been lost. Today, the species is principally confined to:</w:t>
-        <w:br/>
-        <w:br/>
-        <w:t>1. Rajasthan (Primary Stronghold): Holds ~100-150 birds, concentrated in Desert National Park (DNP) and surrounding Jaisalmer, Barmer, and Bikaner districts.</w:t>
-        <w:br/>
-        <w:t>2. Gujarat: Small population of ~5-20 birds in the Kachchh/Naliya area. Recent 'Jumpstart' interventions have revitalized breeding here.</w:t>
-        <w:br/>
-        <w:t>3. Maharashtra: Very small numbers (~2-10 birds) in the Vidarbha region, at high risk of local extinction.</w:t>
-        <w:br/>
-        <w:t>4. Karnataka &amp; Andhra Pradesh: Tiny, non-viable populations (estimated &lt;15 combined).</w:t>
-      </w:r>
-    </w:p>
-    <w:p>
-      <w:r>
-        <w:t>The 2026 'Jumpstart' initiative represents a critical attempt to restore breeding in these peripheral ranges, such as Kutch, by fostering Rajasthan-sourced eggs with wild females. Stabilizing these fragmented distributions remains the highest priority for preventing further local extinctions.</w:t>
+        <w:t>Figure 2: GIB Range Contraction Status by State (Historical vs. 2026).</w:t>
       </w:r>
     </w:p>
     <w:p>
@@ -355,6 +365,16 @@
       </w:pPr>
       <w:r>
         <w:t>4. Demographic Analysis (1969-2026)</w:t>
+      </w:r>
+    </w:p>
+    <w:p>
+      <w:r>
+        <w:t>The demographic trajectory of the Great Indian Bustard represents a catastrophic multi-decadal decline, transitioning from a widespread species to a critically endangered population suffering from severe genetic bottlenecks. In 1969, baseline surveys estimated the national population at 1,260 individuals. By 1978, this number had plummeted to 745, indicating an unsustainable mortality rate driven by hunting and rapid habitat loss.</w:t>
+      </w:r>
+    </w:p>
+    <w:p>
+      <w:r>
+        <w:t>The decline accelerated through the turn of the century. By 2008, the population was estimated at a mere 300 individuals. A rigorous Population Viability Analysis (PVA) conducted by the Wildlife Institute of India (WII) in 2010 warned of imminent extinction if adult mortality was not immediately curtailed. By 2017, the wild population hit a recorded nadir of approximately 128 individuals, restricted to heavily fragmented pockets.</w:t>
       </w:r>
     </w:p>
     <w:p>
@@ -398,248 +418,12 @@
     </w:p>
     <w:p>
       <w:r>
-        <w:t>The demographic trajectory of the GIB shows a catastrophic decline from ~1,260 individuals in 1969 to a nadir of ~128 in 2017. The 2025-2026 data shows the first signs of stabilization due to intensive conservation management and the success of the captive breeding program.</w:t>
+        <w:t>The most recent comprehensive census data from WII (2025) estimates the wild population at 130 ±21 individuals. While this indicates a plateauing of the steep decline, the wild population remains below the threshold for long-term genetic viability without continuous intervention. The lack of genetic flow between the isolated Rajasthan, Gujarat, and Maharashtra populations poses a severe risk of inbreeding depression.</w:t>
       </w:r>
     </w:p>
-    <w:tbl>
-      <w:tblPr>
-        <w:tblStyle w:val="TableGrid"/>
-        <w:tblW w:type="auto" w:w="0"/>
-        <w:tblLook w:firstColumn="1" w:firstRow="1" w:lastColumn="0" w:lastRow="0" w:noHBand="0" w:noVBand="1" w:val="04A0"/>
-      </w:tblPr>
-      <w:tblGrid>
-        <w:gridCol w:w="2880"/>
-        <w:gridCol w:w="2880"/>
-        <w:gridCol w:w="2880"/>
-      </w:tblGrid>
-      <w:tr>
-        <w:tc>
-          <w:tcPr>
-            <w:tcW w:type="dxa" w:w="2880"/>
-          </w:tcPr>
-          <w:p>
-            <w:r>
-              <w:t>Year</w:t>
-            </w:r>
-          </w:p>
-        </w:tc>
-        <w:tc>
-          <w:tcPr>
-            <w:tcW w:type="dxa" w:w="2880"/>
-          </w:tcPr>
-          <w:p>
-            <w:r>
-              <w:t>Wild Estimate (± margin)</w:t>
-            </w:r>
-          </w:p>
-        </w:tc>
-        <w:tc>
-          <w:tcPr>
-            <w:tcW w:type="dxa" w:w="2880"/>
-          </w:tcPr>
-          <w:p>
-            <w:r>
-              <w:t>Captive Population</w:t>
-            </w:r>
-          </w:p>
-        </w:tc>
-      </w:tr>
-      <w:tr>
-        <w:tc>
-          <w:tcPr>
-            <w:tcW w:type="dxa" w:w="2880"/>
-          </w:tcPr>
-          <w:p>
-            <w:r>
-              <w:t>1969</w:t>
-            </w:r>
-          </w:p>
-        </w:tc>
-        <w:tc>
-          <w:tcPr>
-            <w:tcW w:type="dxa" w:w="2880"/>
-          </w:tcPr>
-          <w:p>
-            <w:r>
-              <w:t>1260</w:t>
-            </w:r>
-          </w:p>
-        </w:tc>
-        <w:tc>
-          <w:tcPr>
-            <w:tcW w:type="dxa" w:w="2880"/>
-          </w:tcPr>
-          <w:p>
-            <w:r>
-              <w:t>0</w:t>
-            </w:r>
-          </w:p>
-        </w:tc>
-      </w:tr>
-      <w:tr>
-        <w:tc>
-          <w:tcPr>
-            <w:tcW w:type="dxa" w:w="2880"/>
-          </w:tcPr>
-          <w:p>
-            <w:r>
-              <w:t>1978</w:t>
-            </w:r>
-          </w:p>
-        </w:tc>
-        <w:tc>
-          <w:tcPr>
-            <w:tcW w:type="dxa" w:w="2880"/>
-          </w:tcPr>
-          <w:p>
-            <w:r>
-              <w:t>745</w:t>
-            </w:r>
-          </w:p>
-        </w:tc>
-        <w:tc>
-          <w:tcPr>
-            <w:tcW w:type="dxa" w:w="2880"/>
-          </w:tcPr>
-          <w:p>
-            <w:r>
-              <w:t>0</w:t>
-            </w:r>
-          </w:p>
-        </w:tc>
-      </w:tr>
-      <w:tr>
-        <w:tc>
-          <w:tcPr>
-            <w:tcW w:type="dxa" w:w="2880"/>
-          </w:tcPr>
-          <w:p>
-            <w:r>
-              <w:t>2008</w:t>
-            </w:r>
-          </w:p>
-        </w:tc>
-        <w:tc>
-          <w:tcPr>
-            <w:tcW w:type="dxa" w:w="2880"/>
-          </w:tcPr>
-          <w:p>
-            <w:r>
-              <w:t>300</w:t>
-            </w:r>
-          </w:p>
-        </w:tc>
-        <w:tc>
-          <w:tcPr>
-            <w:tcW w:type="dxa" w:w="2880"/>
-          </w:tcPr>
-          <w:p>
-            <w:r>
-              <w:t>0</w:t>
-            </w:r>
-          </w:p>
-        </w:tc>
-      </w:tr>
-      <w:tr>
-        <w:tc>
-          <w:tcPr>
-            <w:tcW w:type="dxa" w:w="2880"/>
-          </w:tcPr>
-          <w:p>
-            <w:r>
-              <w:t>2017</w:t>
-            </w:r>
-          </w:p>
-        </w:tc>
-        <w:tc>
-          <w:tcPr>
-            <w:tcW w:type="dxa" w:w="2880"/>
-          </w:tcPr>
-          <w:p>
-            <w:r>
-              <w:t>128 (±19)</w:t>
-            </w:r>
-          </w:p>
-        </w:tc>
-        <w:tc>
-          <w:tcPr>
-            <w:tcW w:type="dxa" w:w="2880"/>
-          </w:tcPr>
-          <w:p>
-            <w:r>
-              <w:t>0</w:t>
-            </w:r>
-          </w:p>
-        </w:tc>
-      </w:tr>
-      <w:tr>
-        <w:tc>
-          <w:tcPr>
-            <w:tcW w:type="dxa" w:w="2880"/>
-          </w:tcPr>
-          <w:p>
-            <w:r>
-              <w:t>2025 (Census)</w:t>
-            </w:r>
-          </w:p>
-        </w:tc>
-        <w:tc>
-          <w:tcPr>
-            <w:tcW w:type="dxa" w:w="2880"/>
-          </w:tcPr>
-          <w:p>
-            <w:r>
-              <w:t>130 (±21)</w:t>
-            </w:r>
-          </w:p>
-        </w:tc>
-        <w:tc>
-          <w:tcPr>
-            <w:tcW w:type="dxa" w:w="2880"/>
-          </w:tcPr>
-          <w:p>
-            <w:r>
-              <w:t>70</w:t>
-            </w:r>
-          </w:p>
-        </w:tc>
-      </w:tr>
-      <w:tr>
-        <w:tc>
-          <w:tcPr>
-            <w:tcW w:type="dxa" w:w="2880"/>
-          </w:tcPr>
-          <w:p>
-            <w:r>
-              <w:t>2026 (April)</w:t>
-            </w:r>
-          </w:p>
-        </w:tc>
-        <w:tc>
-          <w:tcPr>
-            <w:tcW w:type="dxa" w:w="2880"/>
-          </w:tcPr>
-          <w:p>
-            <w:r>
-              <w:t>130 (Est)</w:t>
-            </w:r>
-          </w:p>
-        </w:tc>
-        <w:tc>
-          <w:tcPr>
-            <w:tcW w:type="dxa" w:w="2880"/>
-          </w:tcPr>
-          <w:p>
-            <w:r>
-              <w:t>79</w:t>
-            </w:r>
-          </w:p>
-        </w:tc>
-      </w:tr>
-    </w:tbl>
     <w:p>
       <w:r>
-        <w:br/>
+        <w:t>Conversely, the ex-situ demographic trajectory offers a stark contrast and a beacon of hope. Initiated in 2019, the captive breeding program has experienced exponential growth. From a foundational stock of just a few dozen eggs, the captive population reached 70 individuals in 2025 and currently stands at 79 birds as of April 2026. This captive cohort represents an essential genetic insurance policy, ensuring that even if wild populations face stochastic extinction events, the species genome is preserved for future rewilding.</w:t>
       </w:r>
     </w:p>
     <w:p>
@@ -695,13 +479,33 @@
       </w:r>
     </w:p>
     <w:p>
+      <w:r>
+        <w:t>The proliferation of high-tension power lines across the Thar Desert represents the single greatest anthropogenic threat to the survival of the Great Indian Bustard. Quantitative threat matrices and telemetry studies indicate that power line collisions account for a staggering 62% of all adult GIB mortality. In the Jaisalmer priority zone alone, estimates suggest an annual loss of 15% of the population, equating to approximately 18 to 20 birds per year.</w:t>
+      </w:r>
+    </w:p>
+    <w:p>
+      <w:r>
+        <w:t>The vulnerability of the GIB to this infrastructure is rooted in its evolutionary biology. As a heavy, ground-dwelling bird, the GIB possesses limited frontal vision, evolved to scan the horizon for predators rather than looking directly ahead. Combined with their high flight inertia and slow maneuverability, the birds are physically unable to detect and evade thin, high-voltage wires, especially during low-light conditions at dawn and dusk.</w:t>
+      </w:r>
+    </w:p>
+    <w:p>
+      <w:r>
+        <w:t>In response to this crisis, a landmark Supreme Court ruling was issued on December 19, 2025 (M.K. Ranjitsinh v. Union of India). The mandate requires the 100% undergrounding of all low and high-voltage power lines within a critically designated 14,013 sq km 'Priority Zone' in Rajasthan and Gujarat. Where undergrounding is technically unfeasible, the installation of bird flight diverters is mandatory.</w:t>
+      </w:r>
+    </w:p>
+    <w:p>
+      <w:r>
+        <w:t>This mandate, estimated to cost upwards of $3 Billion, has triggered significant friction with India's aggressive renewable energy targets. However, the ruling firmly establishes that the constitutional right to life extends to endangered species, forcing a paradigm shift in how energy evacuation infrastructure is planned in ecologically sensitive arid landscapes.</w:t>
+      </w:r>
+    </w:p>
+    <w:p>
       <w:pPr>
         <w:jc w:val="center"/>
       </w:pPr>
       <w:r>
         <w:drawing>
           <wp:inline xmlns:a="http://schemas.openxmlformats.org/drawingml/2006/main" xmlns:pic="http://schemas.openxmlformats.org/drawingml/2006/picture">
-            <wp:extent cx="5029200" cy="5211074"/>
+            <wp:extent cx="5486400" cy="5684808"/>
             <wp:docPr id="6" name="Picture 6"/>
             <wp:cNvGraphicFramePr>
               <a:graphicFrameLocks noChangeAspect="1"/>
@@ -722,48 +526,7 @@
                   <pic:spPr>
                     <a:xfrm>
                       <a:off x="0" y="0"/>
-                      <a:ext cx="5029200" cy="5211074"/>
-                    </a:xfrm>
-                    <a:prstGeom prst="rect"/>
-                  </pic:spPr>
-                </pic:pic>
-              </a:graphicData>
-            </a:graphic>
-          </wp:inline>
-        </w:drawing>
-      </w:r>
-    </w:p>
-    <w:p>
-      <w:r>
-        <w:t>Quantitative Review: Power line collisions are the primary driver of adult GIB mortality, accounting for 62% of deaths. Due to their limited frontal vision and high flight inertia, GIBs are unable to detect and maneuver away from high-tension wires in low-light conditions. WII studies estimate that 15% of the population (approximately 18-20 birds) is lost annually to collisions in the Jaisalmer belt alone.</w:t>
-      </w:r>
-    </w:p>
-    <w:p>
-      <w:r>
-        <w:drawing>
-          <wp:inline xmlns:a="http://schemas.openxmlformats.org/drawingml/2006/main" xmlns:pic="http://schemas.openxmlformats.org/drawingml/2006/picture">
-            <wp:extent cx="4572000" cy="8125239"/>
-            <wp:docPr id="7" name="Picture 7"/>
-            <wp:cNvGraphicFramePr>
-              <a:graphicFrameLocks noChangeAspect="1"/>
-            </wp:cNvGraphicFramePr>
-            <a:graphic>
-              <a:graphicData uri="http://schemas.openxmlformats.org/drawingml/2006/picture">
-                <pic:pic>
-                  <pic:nvPicPr>
-                    <pic:cNvPr id="0" name="great indian bustard 2.jpg"/>
-                    <pic:cNvPicPr/>
-                  </pic:nvPicPr>
-                  <pic:blipFill>
-                    <a:blip r:embed="rId15"/>
-                    <a:stretch>
-                      <a:fillRect/>
-                    </a:stretch>
-                  </pic:blipFill>
-                  <pic:spPr>
-                    <a:xfrm>
-                      <a:off x="0" y="0"/>
-                      <a:ext cx="4572000" cy="8125239"/>
+                      <a:ext cx="5486400" cy="5684808"/>
                     </a:xfrm>
                     <a:prstGeom prst="rect"/>
                   </pic:spPr>
@@ -780,7 +543,7 @@
         <w:jc w:val="center"/>
       </w:pPr>
       <w:r>
-        <w:t>Figure 2: GIB male in lekking display near high-voltage energy infrastructure. Source: BNHS (2026).</w:t>
+        <w:t>Figure 3: Analytical Breakdown of Mortality Drivers (2026).</w:t>
       </w:r>
     </w:p>
     <w:p>
@@ -798,12 +561,22 @@
     </w:p>
     <w:p>
       <w:r>
-        <w:t>Grasslands in India have historically been classified as 'wastelands,' leading to their large-scale conversion for industrial and agricultural use. In the GIB range, over 20,000 hectares of prime habitat have been fenced off for solar and wind energy parks. While these are 'green' energy sources, their infrastructure (roads, fences, and power lines) fragments the landscape and restricts bustard movement.</w:t>
+        <w:t>Historically classified as 'wastelands' in colonial and post-colonial land registries, India's semi-arid grasslands have been disproportionately targeted for industrial and agricultural conversion. This systemic misclassification has resulted in the catastrophic degradation of the GIB's primary habitat. Over the last two decades, more than 20,000 hectares of prime bustard habitat have been fenced off for the development of utility-scale solar and wind energy parks.</w:t>
       </w:r>
     </w:p>
     <w:p>
       <w:r>
-        <w:t>Furthermore, the expansion of the Indira Gandhi Canal has shifted traditional land use from drought-resistant millets to water-intensive cash crops like cotton and grapes. This shift introduces high levels of pesticides which eliminate the insect biomass (locusts, beetles) that the bustards depend on for survival and reproduction. Overgrazing by livestock also degrades the nesting cover, making eggs vulnerable to predators.</w:t>
+        <w:t>While renewable energy is vital for climate mitigation, the physical infrastructure of these parks—comprising vast arrays of solar panels, chain-link fences, access roads, and substations—severely fragments the landscape. This fragmentation prevents the bustards from moving freely between foraging, lekking, and nesting sites, effectively shrinking their usable habitat far beyond the actual footprint of the parks.</w:t>
+      </w:r>
+    </w:p>
+    <w:p>
+      <w:r>
+        <w:t>Simultaneously, agricultural paradigms in the Thar and Deccan regions have shifted drastically. The expansion of irrigation networks, notably the Indira Gandhi Canal, has transformed traditional dryland farming. Farmers have transitioned from cultivating drought-resistant, bustard-friendly crops like sorghum, bajra, and millets, to water-intensive cash crops such as cotton, sugarcane, and grapes.</w:t>
+      </w:r>
+    </w:p>
+    <w:p>
+      <w:r>
+        <w:t>This agricultural shift is accompanied by a massive increase in the use of chemical pesticides and fertilizers. These chemicals effectively sterilize the landscape of its insect biomass, destroying the primary protein source required by GIB chicks during their crucial early development stages. Furthermore, the intensification of agriculture has led to severe overgrazing by livestock in the remaining grassland patches, trampling nests and leaving eggs exposed to predators.</w:t>
       </w:r>
     </w:p>
     <w:p>
@@ -821,12 +594,22 @@
     </w:p>
     <w:p>
       <w:r>
-        <w:t>The Great Indian Bustard is protected under Schedule I of the Indian Wildlife (Protection) Act, 1972, and is listed as Critically Endangered by the IUCN. Project GIB, launched in 2013, initiated the first large-scale recovery efforts, including the establishment of breeding centers.</w:t>
+        <w:t>The Great Indian Bustard is afforded the highest level of legal protection in India, listed under Schedule I of the Wildlife (Protection) Act, 1972. Internationally, it is classified as Critically Endangered on the IUCN Red List and is included in Appendix I of CITES and the Convention on Migratory Species (CMS). Despite this formidable legal status, enforcement on the ground has historically struggled against the pace of industrialization.</w:t>
       </w:r>
     </w:p>
     <w:p>
       <w:r>
-        <w:t>A landmark Supreme Court ruling on December 19, 2025, significantly altered the conservation landscape. The court mandated the 100% undergrounding of power lines within a 14,013 sq km 'Priority Zone' in Rajasthan and Gujarat. The ruling also established designated 'Powerline Corridors' to facilitate renewable energy evacuation while ensuring no new overhead lines are constructed in critical breeding habitats. This regulatory framework aims to balance India's 500GW renewable energy goal with the species' survival.</w:t>
+        <w:t>In 2013, the Ministry of Environment, Forest and Climate Change (MoEFCC) launched 'Project Great Indian Bustard,' a targeted national initiative aiming to replicate the success of Project Tiger. This led to the establishment of the dedicated conservation breeding centers at Sam and Sudasari in Rajasthan, which have become the cornerstone of the species' survival strategy.</w:t>
+      </w:r>
+    </w:p>
+    <w:p>
+      <w:r>
+        <w:t>The legal framework reached a watershed moment with the Supreme Court's December 19, 2025 ruling. The court not only mandated the undergrounding of power lines but also established an expert committee to oversee the implementation of 'Powerline Corridors.' These corridors are designed to safely channel renewable energy evacuation outside of the critical breeding habitats, balancing the nation's 500GW renewable energy ambitions with ecological imperatives.</w:t>
+      </w:r>
+    </w:p>
+    <w:p>
+      <w:r>
+        <w:t>Furthermore, recent state-level policies have begun focusing on community integration. The 'Godawan Mitra' (Friends of the Bustard) program provides direct financial incentives and stipends to local farmers and pastoralists who locate, report, and protect GIB nests from predators and trampling, effectively turning local communities into frontline conservationists.</w:t>
       </w:r>
     </w:p>
     <w:p>
@@ -839,17 +622,27 @@
         <w:pStyle w:val="Heading1"/>
       </w:pPr>
       <w:r>
-        <w:t>8. Ex-Situ Milestones: AI and the 2026 'Jumpstart'</w:t>
+        <w:t>8. Ex-Situ Milestones: AI and the 2026 "Jumpstart"</w:t>
       </w:r>
     </w:p>
     <w:p>
       <w:r>
-        <w:t>The conservation breeding program, managed by WII in collaboration with the Rajasthan Forest Department, has achieved record success. In March 2026, the 'Jumpstart' initiative successfully translocated a fertile egg from the Sam breeding center in Rajasthan to a wild foster mother's nest in Gujarat's Kutch region—a distance of 770 km. The egg hatched successfully, marking the first local breeding success in Gujarat in a decade.</w:t>
+        <w:t>Given the precarious state of the wild population, ex-situ conservation—specifically the captive breeding program managed by the Wildlife Institute of India (WII)—has become the ultimate safety net for the species. Initiated in 2019 by harvesting eggs from wild nests susceptible to predation, the program has exceeded all demographic expectations, growing the captive flock to 79 individuals by April 2026.</w:t>
       </w:r>
     </w:p>
     <w:p>
       <w:r>
-        <w:t>Artificial Insemination (AI) has also become a standard protocol, with 12 chicks produced via AI in 2025. The captive population now stands at 79 birds, serving as a vital genetic insurance policy. Plans for reintroduction into the wild are slated for late 2026, using 'soft-release' enclosures to minimize human imprinting.</w:t>
+        <w:t>A monumental technological breakthrough was achieved in 2025 with the successful standardization of Artificial Insemination (AI) protocols for the GIB. Overcoming immense logistical and biological hurdles, the veterinary teams produced 12 healthy chicks via AI in a single year. This achievement drastically enhances the genetic management capabilities of the captive flock, ensuring maximum heterozygosity without the risks of natural mating injuries.</w:t>
+      </w:r>
+    </w:p>
+    <w:p>
+      <w:r>
+        <w:t>The program reached another historic milestone in March 2026 with the 'Jumpstart' initiative. In a highly coordinated, multi-state operation, a fertile egg was transported 770 km from the Sam breeding center in Rajasthan to the Naliya grasslands in Gujarat. The egg was successfully placed into the nest of a wild foster mother, who subsequently hatched and is currently rearing the chick.</w:t>
+      </w:r>
+    </w:p>
+    <w:p>
+      <w:r>
+        <w:t>This 'Jumpstart' intervention represents a paradigm shift from pure captive rearing to active wild population augmentation. By utilizing wild foster mothers, the program circumvents the profound challenges of human-imprinting associated with hand-reared chicks. It offers a viable blueprint for repopulating the fragmented ranges in Gujarat and Maharashtra over the next decade.</w:t>
       </w:r>
     </w:p>
     <w:p>
@@ -867,12 +660,22 @@
     </w:p>
     <w:p>
       <w:r>
-        <w:t>There are 26 species of bustards globally, all of which are ground-dwelling and vulnerable to habitat loss. The Great Indian Bustard is the most critically endangered among them. While the Australian Bustard and the Kori Bustard of Africa face similar threats from infrastructure and hunting, the GIB's population density is significantly lower, making it the highest priority for global avian conservation.</w:t>
+        <w:t>The Otididae family comprises 26 species of bustards distributed across the globe, all of which are ground-dwelling, inhabit open landscapes, and are highly vulnerable to habitat modification and hunting. Among these, the Great Indian Bustard holds the tragic distinction of being the most critically endangered, sitting at the absolute apex of the Global Bustard Vulnerability Index.</w:t>
       </w:r>
     </w:p>
     <w:p>
       <w:r>
-        <w:t>India's technological interventions—specifically AI-assisted breeding and the 'Jumpstart' translocation—are now being studied as potential benchmarks for the recovery of other endangered bustard species, such as the Houbara Bustard. The GIB recovery program represents one of the most complex and well-funded avian conservation projects in the world.</w:t>
+        <w:t>A comparative analysis highlights the severity of the GIB's plight. The Great Bustard (Otis tarda) of Europe and Asia, and the Kori Bustard (Ardeotis kori) of Africa, while facing similar threats from agricultural intensification and infrastructure, maintain populations in the thousands across vast, contiguous transnational ranges. The Houbara Bustard (Chlamydotis undulata) of the Middle East has faced intense hunting pressures but benefits from massive, state-sponsored captive breeding and release programs in the UAE and Saudi Arabia.</w:t>
+      </w:r>
+    </w:p>
+    <w:p>
+      <w:r>
+        <w:t>In contrast, the GIB's population is restricted to a few hundred square kilometers in the Thar Desert. However, India's recent response has positioned it as a global leader in avian conservation technology. The successful implementation of AI in a species as heavy and biologically complex as the GIB is a world-first.</w:t>
+      </w:r>
+    </w:p>
+    <w:p>
+      <w:r>
+        <w:t>Furthermore, the 2026 'Jumpstart' egg translocation technique is now being closely studied by international ornithological bodies as a highly effective methodology for augmenting isolated bustard populations worldwide. The GIB recovery program, transitioning from a state of despair to one of rigorous, tech-driven intervention, represents one of the most complex and closely watched conservation projects on the planet.</w:t>
       </w:r>
     </w:p>
     <w:p>
@@ -890,26 +693,33 @@
     </w:p>
     <w:p>
       <w:r>
-        <w:t>The Great Indian Bustard stands at a demographic crossroads. While the decline has been slowed by ex-situ successes, the wild population remains precariously small. Recovery depends on the following strategic pillars:</w:t>
-        <w:br/>
-        <w:br/>
-        <w:t>1. Strict Compliance with the SC 2025 Ruling: Ensure all new power infrastructure in the 14,013 sq km zone is undergrounded.</w:t>
-        <w:br/>
-        <w:t>2. Habitat Connectivity: Create 'Godawan Corridors' between DNP and satellite habitats in Gujarat.</w:t>
-        <w:br/>
-        <w:t>3. Organic Farming Incentives: Support farmers in the Thar Desert to shift back to millet cultivation without pesticides.</w:t>
-        <w:br/>
-        <w:t>4. Community Stewardship: Scale the 'Godawan Mitra' program to provide financial incentives for nest protection.</w:t>
-        <w:br/>
-        <w:t>5. Predator Control: Implement humane but effective stray dog management around breeding enclosures.</w:t>
+        <w:t>The Great Indian Bustard stands at a critical demographic crossroads in 2026. The catastrophic multi-decadal decline has been momentarily halted, not by natural recovery, but by an unprecedented, technology-driven ex-situ conservation effort. While the captive population of 79 birds secures the genetic legacy of the species, the wild population of 130 individuals remains precariously close to the extinction vortex.</w:t>
       </w:r>
     </w:p>
     <w:p>
       <w:r>
+        <w:t>The survival of the species in its natural habitat depends entirely on the rigorous execution of several strategic pillars. First and foremost is the strict, uncompromising compliance with the Supreme Court's 2025 ruling on power line undergrounding. Without neutralizing this 62% mortality driver, any wild augmentation efforts will merely be feeding captive-bred birds into an infrastructural sink.</w:t>
+      </w:r>
+    </w:p>
+    <w:p>
+      <w:r>
+        <w:t>Secondly, landscape-level habitat restoration must be prioritized. This includes the creation of protected 'Godawan Corridors' to re-establish genetic flow between the Thar Desert core and the satellite populations in Gujarat. Agricultural policies must simultaneously pivot, providing heavy subsidies to Thar farmers who return to organic, pesticide-free millet cultivation that supports the insect biomass necessary for bustard nutrition.</w:t>
+      </w:r>
+    </w:p>
+    <w:p>
+      <w:r>
+        <w:t>Finally, the long-term sustainability of these efforts relies on community stewardship. Programs like the 'Godawan Mitra' must be drastically scaled up, ensuring that the economic well-being of the local pastoralists is intrinsically linked to the survival of the bustard. With these integrated strategies, the GIB can transition from the brink of extinction to becoming a symbol of resilient, landscape-level conservation.</w:t>
+      </w:r>
+    </w:p>
+    <w:p>
+      <w:pPr>
+        <w:jc w:val="center"/>
+      </w:pPr>
+      <w:r>
         <w:drawing>
           <wp:inline xmlns:a="http://schemas.openxmlformats.org/drawingml/2006/main" xmlns:pic="http://schemas.openxmlformats.org/drawingml/2006/picture">
-            <wp:extent cx="4572000" cy="5722471"/>
-            <wp:docPr id="8" name="Picture 8"/>
+            <wp:extent cx="5486400" cy="6866965"/>
+            <wp:docPr id="7" name="Picture 7"/>
             <wp:cNvGraphicFramePr>
               <a:graphicFrameLocks noChangeAspect="1"/>
             </wp:cNvGraphicFramePr>
@@ -921,7 +731,7 @@
                     <pic:cNvPicPr/>
                   </pic:nvPicPr>
                   <pic:blipFill>
-                    <a:blip r:embed="rId16"/>
+                    <a:blip r:embed="rId15"/>
                     <a:stretch>
                       <a:fillRect/>
                     </a:stretch>
@@ -929,7 +739,7 @@
                   <pic:spPr>
                     <a:xfrm>
                       <a:off x="0" y="0"/>
-                      <a:ext cx="4572000" cy="5722471"/>
+                      <a:ext cx="5486400" cy="6866965"/>
                     </a:xfrm>
                     <a:prstGeom prst="rect"/>
                   </pic:spPr>
@@ -946,7 +756,7 @@
         <w:jc w:val="center"/>
       </w:pPr>
       <w:r>
-        <w:t>Figure 3: A symbol of hope - The first 'Jumpstart' chick in Gujarat (2026). Source: WII.</w:t>
+        <w:t>Figure 4: A symbol of hope - The first 'Jumpstart' chick in Gujarat (2026). Source: WII.</w:t>
       </w:r>
     </w:p>
     <w:p>

</xml_diff>